<commit_message>
Se termina el reto
</commit_message>
<xml_diff>
--- a/projects/challenge_01/docs/JesusAbelVeraCruz_reto_C1SC1.docx
+++ b/projects/challenge_01/docs/JesusAbelVeraCruz_reto_C1SC1.docx
@@ -45,7 +45,6 @@
     <w:p>
       <w:pPr>
         <w:pStyle w:val="Normal"/>
-        <w:pBdr/>
         <w:jc w:val="end"/>
         <w:rPr>
           <w:rFonts w:ascii="Roboto" w:hAnsi="Roboto" w:eastAsia="Century Gothic" w:cs="Century Gothic"/>
@@ -63,7 +62,6 @@
     <w:p>
       <w:pPr>
         <w:pStyle w:val="Normal"/>
-        <w:pBdr/>
         <w:jc w:val="end"/>
         <w:rPr>
           <w:rFonts w:ascii="Roboto" w:hAnsi="Roboto" w:eastAsia="Century Gothic" w:cs="Century Gothic"/>
@@ -122,13 +120,22 @@
           <w:color w:val="000000"/>
           <w:lang w:val="es-MX"/>
         </w:rPr>
-        <w:t>Nombre del participante:</w:t>
+        <w:t xml:space="preserve">Nombre del participante: </w:t>
+      </w:r>
+      <w:r>
+        <w:rPr>
+          <w:rFonts w:cs="Arial" w:ascii="Roboto" w:hAnsi="Roboto"/>
+          <w:b/>
+          <w:bCs/>
+          <w:color w:val="000000"/>
+          <w:lang w:val="es-MX"/>
+        </w:rPr>
+        <w:t>Jesus Abel Vera Cruz</w:t>
       </w:r>
     </w:p>
     <w:p>
       <w:pPr>
         <w:pStyle w:val="Normal"/>
-        <w:pBdr/>
         <w:rPr>
           <w:rFonts w:ascii="Roboto" w:hAnsi="Roboto" w:eastAsia="Century Gothic" w:cs="Century Gothic"/>
         </w:rPr>
@@ -142,7 +149,6 @@
     <w:p>
       <w:pPr>
         <w:pStyle w:val="Normal"/>
-        <w:pBdr/>
         <w:rPr>
           <w:rFonts w:ascii="Roboto" w:hAnsi="Roboto" w:eastAsia="Century Gothic" w:cs="Century Gothic"/>
           <w:b/>
@@ -159,7 +165,6 @@
     <w:p>
       <w:pPr>
         <w:pStyle w:val="Normal"/>
-        <w:pBdr/>
         <w:rPr>
           <w:rFonts w:ascii="Roboto" w:hAnsi="Roboto" w:eastAsia="Century Gothic" w:cs="Century Gothic"/>
           <w:b/>
@@ -179,7 +184,6 @@
           <w:ilvl w:val="0"/>
           <w:numId w:val="1"/>
         </w:numPr>
-        <w:pBdr/>
         <w:rPr>
           <w:rFonts w:ascii="Roboto" w:hAnsi="Roboto" w:eastAsia="Century Gothic" w:cs="Century Gothic"/>
           <w:color w:val="000000"/>
@@ -208,7 +212,6 @@
           <w:ilvl w:val="0"/>
           <w:numId w:val="1"/>
         </w:numPr>
-        <w:pBdr/>
         <w:rPr>
           <w:rFonts w:ascii="Roboto" w:hAnsi="Roboto" w:eastAsia="Century Gothic" w:cs="Century Gothic"/>
         </w:rPr>
@@ -400,8 +403,8 @@
       </w:tblPr>
       <w:tblGrid>
         <w:gridCol w:w="2510"/>
-        <w:gridCol w:w="1672"/>
-        <w:gridCol w:w="1708"/>
+        <w:gridCol w:w="1671"/>
+        <w:gridCol w:w="1709"/>
         <w:gridCol w:w="4402"/>
       </w:tblGrid>
       <w:tr>
@@ -444,7 +447,7 @@
         </w:tc>
         <w:tc>
           <w:tcPr>
-            <w:tcW w:w="1672" w:type="dxa"/>
+            <w:tcW w:w="1671" w:type="dxa"/>
             <w:tcBorders>
               <w:top w:val="single" w:sz="4" w:space="0" w:color="000000"/>
               <w:start w:val="single" w:sz="4" w:space="0" w:color="000000"/>
@@ -478,7 +481,7 @@
         </w:tc>
         <w:tc>
           <w:tcPr>
-            <w:tcW w:w="1708" w:type="dxa"/>
+            <w:tcW w:w="1709" w:type="dxa"/>
             <w:tcBorders>
               <w:top w:val="single" w:sz="4" w:space="0" w:color="000000"/>
               <w:start w:val="single" w:sz="4" w:space="0" w:color="000000"/>
@@ -581,7 +584,7 @@
         </w:tc>
         <w:tc>
           <w:tcPr>
-            <w:tcW w:w="1672" w:type="dxa"/>
+            <w:tcW w:w="1671" w:type="dxa"/>
             <w:tcBorders>
               <w:top w:val="single" w:sz="4" w:space="0" w:color="000000"/>
               <w:start w:val="single" w:sz="4" w:space="0" w:color="000000"/>
@@ -611,7 +614,7 @@
         </w:tc>
         <w:tc>
           <w:tcPr>
-            <w:tcW w:w="1708" w:type="dxa"/>
+            <w:tcW w:w="1709" w:type="dxa"/>
             <w:tcBorders>
               <w:top w:val="single" w:sz="4" w:space="0" w:color="000000"/>
               <w:start w:val="single" w:sz="4" w:space="0" w:color="000000"/>
@@ -706,7 +709,7 @@
         </w:tc>
         <w:tc>
           <w:tcPr>
-            <w:tcW w:w="1672" w:type="dxa"/>
+            <w:tcW w:w="1671" w:type="dxa"/>
             <w:tcBorders>
               <w:top w:val="single" w:sz="4" w:space="0" w:color="000000"/>
               <w:start w:val="single" w:sz="4" w:space="0" w:color="000000"/>
@@ -736,7 +739,7 @@
         </w:tc>
         <w:tc>
           <w:tcPr>
-            <w:tcW w:w="1708" w:type="dxa"/>
+            <w:tcW w:w="1709" w:type="dxa"/>
             <w:tcBorders>
               <w:top w:val="single" w:sz="4" w:space="0" w:color="000000"/>
               <w:start w:val="single" w:sz="4" w:space="0" w:color="000000"/>
@@ -831,7 +834,7 @@
         </w:tc>
         <w:tc>
           <w:tcPr>
-            <w:tcW w:w="1672" w:type="dxa"/>
+            <w:tcW w:w="1671" w:type="dxa"/>
             <w:tcBorders>
               <w:top w:val="single" w:sz="4" w:space="0" w:color="000000"/>
               <w:start w:val="single" w:sz="4" w:space="0" w:color="000000"/>
@@ -861,7 +864,7 @@
         </w:tc>
         <w:tc>
           <w:tcPr>
-            <w:tcW w:w="1708" w:type="dxa"/>
+            <w:tcW w:w="1709" w:type="dxa"/>
             <w:tcBorders>
               <w:top w:val="single" w:sz="4" w:space="0" w:color="000000"/>
               <w:start w:val="single" w:sz="4" w:space="0" w:color="000000"/>
@@ -957,7 +960,7 @@
         </w:tc>
         <w:tc>
           <w:tcPr>
-            <w:tcW w:w="1672" w:type="dxa"/>
+            <w:tcW w:w="1671" w:type="dxa"/>
             <w:tcBorders>
               <w:top w:val="single" w:sz="4" w:space="0" w:color="000000"/>
               <w:start w:val="single" w:sz="4" w:space="0" w:color="000000"/>
@@ -987,7 +990,7 @@
         </w:tc>
         <w:tc>
           <w:tcPr>
-            <w:tcW w:w="1708" w:type="dxa"/>
+            <w:tcW w:w="1709" w:type="dxa"/>
             <w:tcBorders>
               <w:top w:val="single" w:sz="4" w:space="0" w:color="000000"/>
               <w:start w:val="single" w:sz="4" w:space="0" w:color="000000"/>
@@ -1081,7 +1084,7 @@
         </w:tc>
         <w:tc>
           <w:tcPr>
-            <w:tcW w:w="1672" w:type="dxa"/>
+            <w:tcW w:w="1671" w:type="dxa"/>
             <w:tcBorders>
               <w:top w:val="single" w:sz="4" w:space="0" w:color="000000"/>
               <w:start w:val="single" w:sz="4" w:space="0" w:color="000000"/>
@@ -1111,7 +1114,7 @@
         </w:tc>
         <w:tc>
           <w:tcPr>
-            <w:tcW w:w="1708" w:type="dxa"/>
+            <w:tcW w:w="1709" w:type="dxa"/>
             <w:tcBorders>
               <w:top w:val="single" w:sz="4" w:space="0" w:color="000000"/>
               <w:start w:val="single" w:sz="4" w:space="0" w:color="000000"/>
@@ -1204,7 +1207,7 @@
         </w:tc>
         <w:tc>
           <w:tcPr>
-            <w:tcW w:w="1672" w:type="dxa"/>
+            <w:tcW w:w="1671" w:type="dxa"/>
             <w:tcBorders>
               <w:top w:val="single" w:sz="4" w:space="0" w:color="000000"/>
               <w:start w:val="single" w:sz="4" w:space="0" w:color="000000"/>
@@ -1234,7 +1237,7 @@
         </w:tc>
         <w:tc>
           <w:tcPr>
-            <w:tcW w:w="1708" w:type="dxa"/>
+            <w:tcW w:w="1709" w:type="dxa"/>
             <w:tcBorders>
               <w:top w:val="single" w:sz="4" w:space="0" w:color="000000"/>
               <w:start w:val="single" w:sz="4" w:space="0" w:color="000000"/>
@@ -1328,7 +1331,7 @@
         </w:tc>
         <w:tc>
           <w:tcPr>
-            <w:tcW w:w="1672" w:type="dxa"/>
+            <w:tcW w:w="1671" w:type="dxa"/>
             <w:tcBorders>
               <w:top w:val="single" w:sz="4" w:space="0" w:color="000000"/>
               <w:start w:val="single" w:sz="4" w:space="0" w:color="000000"/>
@@ -1358,7 +1361,7 @@
         </w:tc>
         <w:tc>
           <w:tcPr>
-            <w:tcW w:w="1708" w:type="dxa"/>
+            <w:tcW w:w="1709" w:type="dxa"/>
             <w:tcBorders>
               <w:top w:val="single" w:sz="4" w:space="0" w:color="000000"/>
               <w:start w:val="single" w:sz="4" w:space="0" w:color="000000"/>
@@ -1452,7 +1455,7 @@
         </w:tc>
         <w:tc>
           <w:tcPr>
-            <w:tcW w:w="1672" w:type="dxa"/>
+            <w:tcW w:w="1671" w:type="dxa"/>
             <w:tcBorders>
               <w:top w:val="single" w:sz="4" w:space="0" w:color="000000"/>
               <w:start w:val="single" w:sz="4" w:space="0" w:color="000000"/>
@@ -1482,7 +1485,7 @@
         </w:tc>
         <w:tc>
           <w:tcPr>
-            <w:tcW w:w="1708" w:type="dxa"/>
+            <w:tcW w:w="1709" w:type="dxa"/>
             <w:tcBorders>
               <w:top w:val="single" w:sz="4" w:space="0" w:color="000000"/>
               <w:start w:val="single" w:sz="4" w:space="0" w:color="000000"/>
@@ -1795,9 +1798,9 @@
               <w:tblLook w:noHBand="0" w:noVBand="1" w:firstColumn="0" w:lastRow="0" w:lastColumn="0" w:firstRow="0" w:val="0400"/>
             </w:tblPr>
             <w:tblGrid>
-              <w:gridCol w:w="1529"/>
+              <w:gridCol w:w="1528"/>
               <w:gridCol w:w="1650"/>
-              <w:gridCol w:w="1336"/>
+              <w:gridCol w:w="1337"/>
               <w:gridCol w:w="3300"/>
               <w:gridCol w:w="2295"/>
             </w:tblGrid>
@@ -1805,7 +1808,7 @@
               <w:trPr/>
               <w:tc>
                 <w:tcPr>
-                  <w:tcW w:w="1529" w:type="dxa"/>
+                  <w:tcW w:w="1528" w:type="dxa"/>
                   <w:tcBorders>
                     <w:top w:val="single" w:sz="4" w:space="0" w:color="000000"/>
                     <w:start w:val="single" w:sz="4" w:space="0" w:color="000000"/>
@@ -1867,7 +1870,7 @@
               </w:tc>
               <w:tc>
                 <w:tcPr>
-                  <w:tcW w:w="1336" w:type="dxa"/>
+                  <w:tcW w:w="1337" w:type="dxa"/>
                   <w:tcBorders>
                     <w:top w:val="single" w:sz="4" w:space="0" w:color="000000"/>
                     <w:start w:val="single" w:sz="4" w:space="0" w:color="000000"/>
@@ -1963,7 +1966,7 @@
               <w:trPr/>
               <w:tc>
                 <w:tcPr>
-                  <w:tcW w:w="1529" w:type="dxa"/>
+                  <w:tcW w:w="1528" w:type="dxa"/>
                   <w:tcBorders>
                     <w:top w:val="single" w:sz="4" w:space="0" w:color="000000"/>
                     <w:start w:val="single" w:sz="4" w:space="0" w:color="000000"/>
@@ -2025,7 +2028,7 @@
               </w:tc>
               <w:tc>
                 <w:tcPr>
-                  <w:tcW w:w="1336" w:type="dxa"/>
+                  <w:tcW w:w="1337" w:type="dxa"/>
                   <w:tcBorders>
                     <w:top w:val="single" w:sz="4" w:space="0" w:color="000000"/>
                     <w:start w:val="single" w:sz="4" w:space="0" w:color="000000"/>
@@ -2176,7 +2179,7 @@
               <w:trPr/>
               <w:tc>
                 <w:tcPr>
-                  <w:tcW w:w="1529" w:type="dxa"/>
+                  <w:tcW w:w="1528" w:type="dxa"/>
                   <w:tcBorders>
                     <w:top w:val="single" w:sz="4" w:space="0" w:color="000000"/>
                     <w:start w:val="single" w:sz="4" w:space="0" w:color="000000"/>
@@ -2238,7 +2241,7 @@
               </w:tc>
               <w:tc>
                 <w:tcPr>
-                  <w:tcW w:w="1336" w:type="dxa"/>
+                  <w:tcW w:w="1337" w:type="dxa"/>
                   <w:tcBorders>
                     <w:top w:val="single" w:sz="4" w:space="0" w:color="000000"/>
                     <w:start w:val="single" w:sz="4" w:space="0" w:color="000000"/>
@@ -2403,7 +2406,7 @@
               <w:trPr/>
               <w:tc>
                 <w:tcPr>
-                  <w:tcW w:w="1529" w:type="dxa"/>
+                  <w:tcW w:w="1528" w:type="dxa"/>
                   <w:tcBorders>
                     <w:top w:val="single" w:sz="4" w:space="0" w:color="000000"/>
                     <w:start w:val="single" w:sz="4" w:space="0" w:color="000000"/>
@@ -2464,7 +2467,7 @@
               </w:tc>
               <w:tc>
                 <w:tcPr>
-                  <w:tcW w:w="1336" w:type="dxa"/>
+                  <w:tcW w:w="1337" w:type="dxa"/>
                   <w:tcBorders>
                     <w:top w:val="single" w:sz="4" w:space="0" w:color="000000"/>
                     <w:start w:val="single" w:sz="4" w:space="0" w:color="000000"/>
@@ -2724,15 +2727,15 @@
               <w:tblLook w:noHBand="0" w:noVBand="1" w:firstColumn="0" w:lastRow="0" w:lastColumn="0" w:firstRow="0" w:val="0400"/>
             </w:tblPr>
             <w:tblGrid>
-              <w:gridCol w:w="1575"/>
-              <w:gridCol w:w="1573"/>
+              <w:gridCol w:w="1574"/>
+              <w:gridCol w:w="1574"/>
               <w:gridCol w:w="6966"/>
             </w:tblGrid>
             <w:tr>
               <w:trPr/>
               <w:tc>
                 <w:tcPr>
-                  <w:tcW w:w="1575" w:type="dxa"/>
+                  <w:tcW w:w="1574" w:type="dxa"/>
                   <w:tcBorders>
                     <w:top w:val="single" w:sz="4" w:space="0" w:color="000000"/>
                     <w:start w:val="single" w:sz="4" w:space="0" w:color="000000"/>
@@ -2763,7 +2766,7 @@
               </w:tc>
               <w:tc>
                 <w:tcPr>
-                  <w:tcW w:w="1573" w:type="dxa"/>
+                  <w:tcW w:w="1574" w:type="dxa"/>
                   <w:tcBorders>
                     <w:top w:val="single" w:sz="4" w:space="0" w:color="000000"/>
                     <w:start w:val="single" w:sz="4" w:space="0" w:color="000000"/>
@@ -2828,7 +2831,7 @@
               <w:trPr/>
               <w:tc>
                 <w:tcPr>
-                  <w:tcW w:w="1575" w:type="dxa"/>
+                  <w:tcW w:w="1574" w:type="dxa"/>
                   <w:tcBorders>
                     <w:top w:val="single" w:sz="4" w:space="0" w:color="000000"/>
                     <w:start w:val="single" w:sz="4" w:space="0" w:color="000000"/>
@@ -2858,7 +2861,7 @@
               </w:tc>
               <w:tc>
                 <w:tcPr>
-                  <w:tcW w:w="1573" w:type="dxa"/>
+                  <w:tcW w:w="1574" w:type="dxa"/>
                   <w:tcBorders>
                     <w:top w:val="single" w:sz="4" w:space="0" w:color="000000"/>
                     <w:start w:val="single" w:sz="4" w:space="0" w:color="000000"/>
@@ -2924,7 +2927,7 @@
               <w:trPr/>
               <w:tc>
                 <w:tcPr>
-                  <w:tcW w:w="1575" w:type="dxa"/>
+                  <w:tcW w:w="1574" w:type="dxa"/>
                   <w:tcBorders>
                     <w:top w:val="single" w:sz="4" w:space="0" w:color="000000"/>
                     <w:start w:val="single" w:sz="4" w:space="0" w:color="000000"/>
@@ -2954,7 +2957,7 @@
               </w:tc>
               <w:tc>
                 <w:tcPr>
-                  <w:tcW w:w="1573" w:type="dxa"/>
+                  <w:tcW w:w="1574" w:type="dxa"/>
                   <w:tcBorders>
                     <w:top w:val="single" w:sz="4" w:space="0" w:color="000000"/>
                     <w:start w:val="single" w:sz="4" w:space="0" w:color="000000"/>
@@ -3020,7 +3023,7 @@
               <w:trPr/>
               <w:tc>
                 <w:tcPr>
-                  <w:tcW w:w="1575" w:type="dxa"/>
+                  <w:tcW w:w="1574" w:type="dxa"/>
                   <w:tcBorders>
                     <w:top w:val="single" w:sz="4" w:space="0" w:color="000000"/>
                     <w:start w:val="single" w:sz="4" w:space="0" w:color="000000"/>
@@ -3049,7 +3052,7 @@
               </w:tc>
               <w:tc>
                 <w:tcPr>
-                  <w:tcW w:w="1573" w:type="dxa"/>
+                  <w:tcW w:w="1574" w:type="dxa"/>
                   <w:tcBorders>
                     <w:top w:val="single" w:sz="4" w:space="0" w:color="000000"/>
                     <w:start w:val="single" w:sz="4" w:space="0" w:color="000000"/>
@@ -3211,8 +3214,8 @@
             </w:tblPr>
             <w:tblGrid>
               <w:gridCol w:w="1575"/>
-              <w:gridCol w:w="1619"/>
-              <w:gridCol w:w="6916"/>
+              <w:gridCol w:w="1618"/>
+              <w:gridCol w:w="6917"/>
             </w:tblGrid>
             <w:tr>
               <w:trPr>
@@ -3251,7 +3254,7 @@
               </w:tc>
               <w:tc>
                 <w:tcPr>
-                  <w:tcW w:w="1619" w:type="dxa"/>
+                  <w:tcW w:w="1618" w:type="dxa"/>
                   <w:tcBorders>
                     <w:top w:val="single" w:sz="4" w:space="0" w:color="000000"/>
                     <w:start w:val="single" w:sz="4" w:space="0" w:color="000000"/>
@@ -3282,7 +3285,7 @@
               </w:tc>
               <w:tc>
                 <w:tcPr>
-                  <w:tcW w:w="6916" w:type="dxa"/>
+                  <w:tcW w:w="6917" w:type="dxa"/>
                   <w:tcBorders>
                     <w:top w:val="single" w:sz="4" w:space="0" w:color="000000"/>
                     <w:start w:val="single" w:sz="4" w:space="0" w:color="000000"/>
@@ -3347,7 +3350,7 @@
               </w:tc>
               <w:tc>
                 <w:tcPr>
-                  <w:tcW w:w="1619" w:type="dxa"/>
+                  <w:tcW w:w="1618" w:type="dxa"/>
                   <w:tcBorders>
                     <w:top w:val="single" w:sz="4" w:space="0" w:color="000000"/>
                     <w:start w:val="single" w:sz="4" w:space="0" w:color="000000"/>
@@ -3378,7 +3381,7 @@
               </w:tc>
               <w:tc>
                 <w:tcPr>
-                  <w:tcW w:w="6916" w:type="dxa"/>
+                  <w:tcW w:w="6917" w:type="dxa"/>
                   <w:tcBorders>
                     <w:top w:val="single" w:sz="4" w:space="0" w:color="000000"/>
                     <w:start w:val="single" w:sz="4" w:space="0" w:color="000000"/>
@@ -3463,7 +3466,7 @@
                   </w:pPr>
                   <w:r>
                     <w:drawing>
-                      <wp:anchor distT="0" distB="0" distL="114300" distR="114300" simplePos="0" relativeHeight="15" behindDoc="0" locked="0" layoutInCell="1" allowOverlap="1">
+                      <wp:anchor distT="0" distB="0" distL="114300" distR="114300" simplePos="0" relativeHeight="16" behindDoc="0" locked="0" layoutInCell="1" allowOverlap="1">
                         <wp:simplePos x="0" y="0"/>
                         <wp:positionH relativeFrom="column">
                           <wp:posOffset>-635</wp:posOffset>
@@ -3566,7 +3569,7 @@
               </w:tc>
               <w:tc>
                 <w:tcPr>
-                  <w:tcW w:w="1619" w:type="dxa"/>
+                  <w:tcW w:w="1618" w:type="dxa"/>
                   <w:tcBorders>
                     <w:top w:val="single" w:sz="4" w:space="0" w:color="000000"/>
                     <w:start w:val="single" w:sz="4" w:space="0" w:color="000000"/>
@@ -3597,7 +3600,7 @@
               </w:tc>
               <w:tc>
                 <w:tcPr>
-                  <w:tcW w:w="6916" w:type="dxa"/>
+                  <w:tcW w:w="6917" w:type="dxa"/>
                   <w:tcBorders>
                     <w:top w:val="single" w:sz="4" w:space="0" w:color="000000"/>
                     <w:start w:val="single" w:sz="4" w:space="0" w:color="000000"/>
@@ -3638,7 +3641,7 @@
                   </w:pPr>
                   <w:r>
                     <w:drawing>
-                      <wp:anchor distT="0" distB="0" distL="114300" distR="114300" simplePos="0" relativeHeight="16" behindDoc="0" locked="0" layoutInCell="1" allowOverlap="1">
+                      <wp:anchor distT="0" distB="0" distL="114300" distR="114300" simplePos="0" relativeHeight="17" behindDoc="0" locked="0" layoutInCell="1" allowOverlap="1">
                         <wp:simplePos x="0" y="0"/>
                         <wp:positionH relativeFrom="column">
                           <wp:posOffset>-635</wp:posOffset>
@@ -3729,7 +3732,7 @@
               </w:tc>
               <w:tc>
                 <w:tcPr>
-                  <w:tcW w:w="1619" w:type="dxa"/>
+                  <w:tcW w:w="1618" w:type="dxa"/>
                   <w:tcBorders>
                     <w:top w:val="single" w:sz="4" w:space="0" w:color="000000"/>
                     <w:start w:val="single" w:sz="4" w:space="0" w:color="000000"/>
@@ -3760,7 +3763,7 @@
               </w:tc>
               <w:tc>
                 <w:tcPr>
-                  <w:tcW w:w="6916" w:type="dxa"/>
+                  <w:tcW w:w="6917" w:type="dxa"/>
                   <w:tcBorders>
                     <w:top w:val="single" w:sz="4" w:space="0" w:color="000000"/>
                     <w:start w:val="single" w:sz="4" w:space="0" w:color="000000"/>
@@ -3780,7 +3783,7 @@
                   </w:pPr>
                   <w:r>
                     <w:drawing>
-                      <wp:anchor distT="0" distB="0" distL="114300" distR="114300" simplePos="0" relativeHeight="17" behindDoc="0" locked="0" layoutInCell="1" allowOverlap="1">
+                      <wp:anchor distT="0" distB="0" distL="114300" distR="114300" simplePos="0" relativeHeight="18" behindDoc="0" locked="0" layoutInCell="1" allowOverlap="1">
                         <wp:simplePos x="0" y="0"/>
                         <wp:positionH relativeFrom="column">
                           <wp:posOffset>18415</wp:posOffset>
@@ -3970,8 +3973,8 @@
             </w:tblPr>
             <w:tblGrid>
               <w:gridCol w:w="1575"/>
-              <w:gridCol w:w="1634"/>
-              <w:gridCol w:w="6901"/>
+              <w:gridCol w:w="1633"/>
+              <w:gridCol w:w="6902"/>
             </w:tblGrid>
             <w:tr>
               <w:trPr/>
@@ -4008,7 +4011,7 @@
               </w:tc>
               <w:tc>
                 <w:tcPr>
-                  <w:tcW w:w="1634" w:type="dxa"/>
+                  <w:tcW w:w="1633" w:type="dxa"/>
                   <w:tcBorders>
                     <w:top w:val="single" w:sz="4" w:space="0" w:color="000000"/>
                     <w:start w:val="single" w:sz="4" w:space="0" w:color="000000"/>
@@ -4039,7 +4042,7 @@
               </w:tc>
               <w:tc>
                 <w:tcPr>
-                  <w:tcW w:w="6901" w:type="dxa"/>
+                  <w:tcW w:w="6902" w:type="dxa"/>
                   <w:tcBorders>
                     <w:top w:val="single" w:sz="4" w:space="0" w:color="000000"/>
                     <w:start w:val="single" w:sz="4" w:space="0" w:color="000000"/>
@@ -4103,7 +4106,7 @@
               </w:tc>
               <w:tc>
                 <w:tcPr>
-                  <w:tcW w:w="1634" w:type="dxa"/>
+                  <w:tcW w:w="1633" w:type="dxa"/>
                   <w:tcBorders>
                     <w:top w:val="single" w:sz="4" w:space="0" w:color="000000"/>
                     <w:start w:val="single" w:sz="4" w:space="0" w:color="000000"/>
@@ -4133,7 +4136,7 @@
               </w:tc>
               <w:tc>
                 <w:tcPr>
-                  <w:tcW w:w="6901" w:type="dxa"/>
+                  <w:tcW w:w="6902" w:type="dxa"/>
                   <w:tcBorders>
                     <w:top w:val="single" w:sz="4" w:space="0" w:color="000000"/>
                     <w:start w:val="single" w:sz="4" w:space="0" w:color="000000"/>
@@ -4195,7 +4198,7 @@
               </w:tc>
               <w:tc>
                 <w:tcPr>
-                  <w:tcW w:w="1634" w:type="dxa"/>
+                  <w:tcW w:w="1633" w:type="dxa"/>
                   <w:tcBorders>
                     <w:top w:val="single" w:sz="4" w:space="0" w:color="000000"/>
                     <w:start w:val="single" w:sz="4" w:space="0" w:color="000000"/>
@@ -4225,7 +4228,7 @@
               </w:tc>
               <w:tc>
                 <w:tcPr>
-                  <w:tcW w:w="6901" w:type="dxa"/>
+                  <w:tcW w:w="6902" w:type="dxa"/>
                   <w:tcBorders>
                     <w:top w:val="single" w:sz="4" w:space="0" w:color="000000"/>
                     <w:start w:val="single" w:sz="4" w:space="0" w:color="000000"/>
@@ -4286,7 +4289,7 @@
               </w:tc>
               <w:tc>
                 <w:tcPr>
-                  <w:tcW w:w="1634" w:type="dxa"/>
+                  <w:tcW w:w="1633" w:type="dxa"/>
                   <w:tcBorders>
                     <w:top w:val="single" w:sz="4" w:space="0" w:color="000000"/>
                     <w:start w:val="single" w:sz="4" w:space="0" w:color="000000"/>
@@ -4316,7 +4319,7 @@
               </w:tc>
               <w:tc>
                 <w:tcPr>
-                  <w:tcW w:w="6901" w:type="dxa"/>
+                  <w:tcW w:w="6902" w:type="dxa"/>
                   <w:tcBorders>
                     <w:top w:val="single" w:sz="4" w:space="0" w:color="000000"/>
                     <w:start w:val="single" w:sz="4" w:space="0" w:color="000000"/>
@@ -4474,15 +4477,15 @@
               <w:tblLook w:noHBand="0" w:noVBand="1" w:firstColumn="0" w:lastRow="0" w:lastColumn="0" w:firstRow="0" w:val="0400"/>
             </w:tblPr>
             <w:tblGrid>
-              <w:gridCol w:w="1565"/>
-              <w:gridCol w:w="1724"/>
+              <w:gridCol w:w="1564"/>
+              <w:gridCol w:w="1725"/>
               <w:gridCol w:w="6825"/>
             </w:tblGrid>
             <w:tr>
               <w:trPr/>
               <w:tc>
                 <w:tcPr>
-                  <w:tcW w:w="1565" w:type="dxa"/>
+                  <w:tcW w:w="1564" w:type="dxa"/>
                   <w:tcBorders>
                     <w:top w:val="single" w:sz="4" w:space="0" w:color="000000"/>
                     <w:start w:val="single" w:sz="4" w:space="0" w:color="000000"/>
@@ -4513,7 +4516,7 @@
               </w:tc>
               <w:tc>
                 <w:tcPr>
-                  <w:tcW w:w="1724" w:type="dxa"/>
+                  <w:tcW w:w="1725" w:type="dxa"/>
                   <w:tcBorders>
                     <w:top w:val="single" w:sz="4" w:space="0" w:color="000000"/>
                     <w:start w:val="single" w:sz="4" w:space="0" w:color="000000"/>
@@ -4580,7 +4583,7 @@
               </w:trPr>
               <w:tc>
                 <w:tcPr>
-                  <w:tcW w:w="1565" w:type="dxa"/>
+                  <w:tcW w:w="1564" w:type="dxa"/>
                   <w:tcBorders>
                     <w:top w:val="single" w:sz="4" w:space="0" w:color="000000"/>
                     <w:start w:val="single" w:sz="4" w:space="0" w:color="000000"/>
@@ -4610,7 +4613,7 @@
               </w:tc>
               <w:tc>
                 <w:tcPr>
-                  <w:tcW w:w="1724" w:type="dxa"/>
+                  <w:tcW w:w="1725" w:type="dxa"/>
                   <w:tcBorders>
                     <w:top w:val="single" w:sz="4" w:space="0" w:color="000000"/>
                     <w:start w:val="single" w:sz="4" w:space="0" w:color="000000"/>
@@ -4663,47 +4666,7 @@
                       <w:color w:val="202124"/>
                       <w:highlight w:val="white"/>
                     </w:rPr>
-                    <w:t xml:space="preserve">Se puede usar </w:t>
-                  </w:r>
-                  <w:r>
-                    <w:rPr>
-                      <w:rFonts w:eastAsia="Arial" w:cs="Arial" w:ascii="Roboto" w:hAnsi="Roboto"/>
-                      <w:color w:val="202124"/>
-                      <w:highlight w:val="white"/>
-                    </w:rPr>
-                    <w:t xml:space="preserve">la desviación estándar </w:t>
-                  </w:r>
-                  <w:r>
-                    <w:rPr>
-                      <w:rFonts w:eastAsia="Arial" w:cs="Arial" w:ascii="Roboto" w:hAnsi="Roboto"/>
-                      <w:color w:val="202124"/>
-                      <w:highlight w:val="white"/>
-                    </w:rPr>
-                    <w:t xml:space="preserve"> por</w:t>
-                  </w:r>
-                  <w:r>
-                    <w:rPr>
-                      <w:rFonts w:eastAsia="Arial" w:cs="Arial" w:ascii="Roboto" w:hAnsi="Roboto"/>
-                      <w:color w:val="202124"/>
-                      <w:highlight w:val="white"/>
-                    </w:rPr>
-                    <w:t xml:space="preserve">que la distribución es aproximadamente simétrica, </w:t>
-                  </w:r>
-                  <w:r>
-                    <w:rPr>
-                      <w:rFonts w:eastAsia="Arial" w:cs="Arial" w:ascii="Roboto" w:hAnsi="Roboto"/>
-                      <w:color w:val="202124"/>
-                      <w:highlight w:val="white"/>
-                    </w:rPr>
-                    <w:t xml:space="preserve"> no tiene valores atípicos y </w:t>
-                  </w:r>
-                  <w:r>
-                    <w:rPr>
-                      <w:rFonts w:eastAsia="Arial" w:cs="Arial" w:ascii="Roboto" w:hAnsi="Roboto"/>
-                      <w:color w:val="202124"/>
-                      <w:highlight w:val="white"/>
-                    </w:rPr>
-                    <w:t xml:space="preserve">el </w:t>
+                    <w:t xml:space="preserve">Se puede usar la desviación estándar  porque la distribución es aproximadamente simétrica,  no tiene valores atípicos y el </w:t>
                   </w:r>
                   <w:r>
                     <w:rPr>
@@ -4723,7 +4686,7 @@
               </w:trPr>
               <w:tc>
                 <w:tcPr>
-                  <w:tcW w:w="1565" w:type="dxa"/>
+                  <w:tcW w:w="1564" w:type="dxa"/>
                   <w:tcBorders>
                     <w:top w:val="single" w:sz="4" w:space="0" w:color="000000"/>
                     <w:start w:val="single" w:sz="4" w:space="0" w:color="000000"/>
@@ -4753,7 +4716,7 @@
               </w:tc>
               <w:tc>
                 <w:tcPr>
-                  <w:tcW w:w="1724" w:type="dxa"/>
+                  <w:tcW w:w="1725" w:type="dxa"/>
                   <w:tcBorders>
                     <w:top w:val="single" w:sz="4" w:space="0" w:color="000000"/>
                     <w:start w:val="single" w:sz="4" w:space="0" w:color="000000"/>
@@ -4806,47 +4769,7 @@
                       <w:color w:val="202124"/>
                       <w:highlight w:val="white"/>
                     </w:rPr>
-                    <w:t xml:space="preserve">Se puede usar </w:t>
-                  </w:r>
-                  <w:r>
-                    <w:rPr>
-                      <w:rFonts w:eastAsia="Arial" w:cs="Arial" w:ascii="Roboto" w:hAnsi="Roboto"/>
-                      <w:color w:val="202124"/>
-                      <w:highlight w:val="white"/>
-                    </w:rPr>
-                    <w:t>la</w:t>
-                  </w:r>
-                  <w:r>
-                    <w:rPr>
-                      <w:rFonts w:eastAsia="Arial" w:cs="Arial" w:ascii="Roboto" w:hAnsi="Roboto"/>
-                      <w:color w:val="202124"/>
-                      <w:highlight w:val="white"/>
-                    </w:rPr>
-                    <w:t xml:space="preserve"> medida </w:t>
-                  </w:r>
-                  <w:r>
-                    <w:rPr>
-                      <w:rFonts w:eastAsia="Arial" w:cs="Arial" w:ascii="Roboto" w:hAnsi="Roboto"/>
-                      <w:color w:val="202124"/>
-                      <w:highlight w:val="white"/>
-                    </w:rPr>
-                    <w:t>IQR</w:t>
-                  </w:r>
-                  <w:r>
-                    <w:rPr>
-                      <w:rFonts w:eastAsia="Arial" w:cs="Arial" w:ascii="Roboto" w:hAnsi="Roboto"/>
-                      <w:color w:val="202124"/>
-                      <w:highlight w:val="white"/>
-                    </w:rPr>
-                    <w:t xml:space="preserve"> porque ya sabemos si tenemos datos atípicos (62). </w:t>
-                  </w:r>
-                  <w:r>
-                    <w:rPr>
-                      <w:rFonts w:eastAsia="Arial" w:cs="Arial" w:ascii="Roboto" w:hAnsi="Roboto"/>
-                      <w:color w:val="202124"/>
-                      <w:highlight w:val="white"/>
-                    </w:rPr>
-                    <w:t>El IQR es menos sensible a valores extremos.</w:t>
+                    <w:t>Se puede usar la medida IQR porque ya sabemos si tenemos datos atípicos (62). El IQR es menos sensible a valores extremos.</w:t>
                   </w:r>
                 </w:p>
               </w:tc>
@@ -4855,7 +4778,7 @@
               <w:trPr/>
               <w:tc>
                 <w:tcPr>
-                  <w:tcW w:w="1565" w:type="dxa"/>
+                  <w:tcW w:w="1564" w:type="dxa"/>
                   <w:tcBorders>
                     <w:top w:val="single" w:sz="4" w:space="0" w:color="000000"/>
                     <w:start w:val="single" w:sz="4" w:space="0" w:color="000000"/>
@@ -4884,7 +4807,7 @@
               </w:tc>
               <w:tc>
                 <w:tcPr>
-                  <w:tcW w:w="1724" w:type="dxa"/>
+                  <w:tcW w:w="1725" w:type="dxa"/>
                   <w:tcBorders>
                     <w:top w:val="single" w:sz="4" w:space="0" w:color="000000"/>
                     <w:start w:val="single" w:sz="4" w:space="0" w:color="000000"/>
@@ -4937,55 +4860,7 @@
                       <w:color w:val="202124"/>
                       <w:highlight w:val="white"/>
                     </w:rPr>
-                    <w:t>S</w:t>
-                  </w:r>
-                  <w:r>
-                    <w:rPr>
-                      <w:rFonts w:eastAsia="Arial" w:cs="Arial" w:ascii="Roboto" w:hAnsi="Roboto"/>
-                      <w:color w:val="202124"/>
-                      <w:highlight w:val="white"/>
-                    </w:rPr>
-                    <w:t xml:space="preserve">e puede usar </w:t>
-                  </w:r>
-                  <w:r>
-                    <w:rPr>
-                      <w:rFonts w:eastAsia="Arial" w:cs="Arial" w:ascii="Roboto" w:hAnsi="Roboto"/>
-                      <w:color w:val="202124"/>
-                      <w:highlight w:val="white"/>
-                    </w:rPr>
-                    <w:t>la</w:t>
-                  </w:r>
-                  <w:r>
-                    <w:rPr>
-                      <w:rFonts w:eastAsia="Arial" w:cs="Arial" w:ascii="Roboto" w:hAnsi="Roboto"/>
-                      <w:color w:val="202124"/>
-                      <w:highlight w:val="white"/>
-                    </w:rPr>
-                    <w:t xml:space="preserve"> medida </w:t>
-                  </w:r>
-                  <w:r>
-                    <w:rPr>
-                      <w:rFonts w:eastAsia="Arial" w:cs="Arial" w:ascii="Roboto" w:hAnsi="Roboto"/>
-                      <w:color w:val="202124"/>
-                      <w:highlight w:val="white"/>
-                    </w:rPr>
-                    <w:t>IQR</w:t>
-                  </w:r>
-                  <w:r>
-                    <w:rPr>
-                      <w:rFonts w:eastAsia="Arial" w:cs="Arial" w:ascii="Roboto" w:hAnsi="Roboto"/>
-                      <w:color w:val="202124"/>
-                      <w:highlight w:val="white"/>
-                    </w:rPr>
-                    <w:t xml:space="preserve"> porque ya sabemos si tenemos datos atípicos (22 y 30) .</w:t>
-                  </w:r>
-                  <w:r>
-                    <w:rPr>
-                      <w:rFonts w:eastAsia="Arial" w:cs="Arial" w:ascii="Roboto" w:hAnsi="Roboto"/>
-                      <w:color w:val="202124"/>
-                      <w:highlight w:val="white"/>
-                    </w:rPr>
-                    <w:t>El IQR es menos sensible a valores extremos.</w:t>
+                    <w:t>Se puede usar la medida IQR porque ya sabemos si tenemos datos atípicos (22 y 30) .El IQR es menos sensible a valores extremos.</w:t>
                   </w:r>
                 </w:p>
               </w:tc>
@@ -5168,15 +5043,15 @@
               <w:tblLook w:noHBand="0" w:noVBand="1" w:firstColumn="0" w:lastRow="0" w:lastColumn="0" w:firstRow="0" w:val="0400"/>
             </w:tblPr>
             <w:tblGrid>
-              <w:gridCol w:w="1565"/>
-              <w:gridCol w:w="4129"/>
+              <w:gridCol w:w="1564"/>
+              <w:gridCol w:w="4130"/>
               <w:gridCol w:w="4420"/>
             </w:tblGrid>
             <w:tr>
               <w:trPr/>
               <w:tc>
                 <w:tcPr>
-                  <w:tcW w:w="1565" w:type="dxa"/>
+                  <w:tcW w:w="1564" w:type="dxa"/>
                   <w:tcBorders>
                     <w:top w:val="single" w:sz="4" w:space="0" w:color="000000"/>
                     <w:start w:val="single" w:sz="4" w:space="0" w:color="000000"/>
@@ -5207,7 +5082,7 @@
               </w:tc>
               <w:tc>
                 <w:tcPr>
-                  <w:tcW w:w="4129" w:type="dxa"/>
+                  <w:tcW w:w="4130" w:type="dxa"/>
                   <w:tcBorders>
                     <w:top w:val="single" w:sz="4" w:space="0" w:color="000000"/>
                     <w:start w:val="single" w:sz="4" w:space="0" w:color="000000"/>
@@ -5272,7 +5147,7 @@
               <w:trPr/>
               <w:tc>
                 <w:tcPr>
-                  <w:tcW w:w="1565" w:type="dxa"/>
+                  <w:tcW w:w="1564" w:type="dxa"/>
                   <w:tcBorders>
                     <w:top w:val="single" w:sz="4" w:space="0" w:color="000000"/>
                     <w:start w:val="single" w:sz="4" w:space="0" w:color="000000"/>
@@ -5298,7 +5173,7 @@
               </w:tc>
               <w:tc>
                 <w:tcPr>
-                  <w:tcW w:w="4129" w:type="dxa"/>
+                  <w:tcW w:w="4130" w:type="dxa"/>
                   <w:tcBorders>
                     <w:top w:val="single" w:sz="4" w:space="0" w:color="000000"/>
                     <w:start w:val="single" w:sz="4" w:space="0" w:color="000000"/>
@@ -5322,23 +5197,7 @@
                       <w:color w:val="202124"/>
                       <w:highlight w:val="white"/>
                     </w:rPr>
-                    <w:t>[</w:t>
-                  </w:r>
-                  <w:r>
-                    <w:rPr>
-                      <w:rFonts w:eastAsia="Arial" w:cs="Arial" w:ascii="Roboto" w:hAnsi="Roboto"/>
-                      <w:color w:val="202124"/>
-                      <w:highlight w:val="white"/>
-                    </w:rPr>
-                    <w:t>0 , 90.72</w:t>
-                  </w:r>
-                  <w:r>
-                    <w:rPr>
-                      <w:rFonts w:eastAsia="Arial" w:cs="Arial" w:ascii="Roboto" w:hAnsi="Roboto"/>
-                      <w:color w:val="202124"/>
-                      <w:highlight w:val="white"/>
-                    </w:rPr>
-                    <w:t>]</w:t>
+                    <w:t>[0 , 90.72]</w:t>
                   </w:r>
                 </w:p>
               </w:tc>
@@ -5376,7 +5235,7 @@
               <w:trPr/>
               <w:tc>
                 <w:tcPr>
-                  <w:tcW w:w="1565" w:type="dxa"/>
+                  <w:tcW w:w="1564" w:type="dxa"/>
                   <w:tcBorders>
                     <w:top w:val="single" w:sz="4" w:space="0" w:color="000000"/>
                     <w:start w:val="single" w:sz="4" w:space="0" w:color="000000"/>
@@ -5402,7 +5261,7 @@
               </w:tc>
               <w:tc>
                 <w:tcPr>
-                  <w:tcW w:w="4129" w:type="dxa"/>
+                  <w:tcW w:w="4130" w:type="dxa"/>
                   <w:tcBorders>
                     <w:top w:val="single" w:sz="4" w:space="0" w:color="000000"/>
                     <w:start w:val="single" w:sz="4" w:space="0" w:color="000000"/>
@@ -5426,31 +5285,7 @@
                       <w:color w:val="202124"/>
                       <w:highlight w:val="white"/>
                     </w:rPr>
-                    <w:t>[</w:t>
-                  </w:r>
-                  <w:r>
-                    <w:rPr>
-                      <w:rFonts w:eastAsia="Arial" w:cs="Arial" w:ascii="Roboto" w:hAnsi="Roboto"/>
-                      <w:color w:val="202124"/>
-                      <w:highlight w:val="white"/>
-                    </w:rPr>
-                    <w:t>20, 52,72</w:t>
-                  </w:r>
-                  <w:r>
-                    <w:rPr>
-                      <w:rFonts w:eastAsia="Arial" w:cs="Arial" w:ascii="Roboto" w:hAnsi="Roboto"/>
-                      <w:color w:val="202124"/>
-                      <w:highlight w:val="white"/>
-                    </w:rPr>
-                    <w:t>]</w:t>
-                  </w:r>
-                  <w:r>
-                    <w:rPr>
-                      <w:rFonts w:eastAsia="Arial" w:cs="Arial" w:ascii="Roboto" w:hAnsi="Roboto"/>
-                      <w:color w:val="202124"/>
-                      <w:highlight w:val="white"/>
-                    </w:rPr>
-                    <w:t xml:space="preserve"> </w:t>
+                    <w:t xml:space="preserve">[20, 52,72] </w:t>
                   </w:r>
                 </w:p>
               </w:tc>
@@ -5479,15 +5314,7 @@
                       <w:color w:val="202124"/>
                       <w:highlight w:val="white"/>
                     </w:rPr>
-                    <w:t xml:space="preserve">El 96% de los empleados tiene entre 20 y 52-72 años de edad. </w:t>
-                  </w:r>
-                  <w:r>
-                    <w:rPr>
-                      <w:rFonts w:eastAsia="Arial" w:cs="Arial" w:ascii="Roboto" w:hAnsi="Roboto"/>
-                      <w:color w:val="202124"/>
-                      <w:highlight w:val="white"/>
-                    </w:rPr>
-                    <w:t xml:space="preserve">El intervalo teórico es de [16.48,52.72] </w:t>
+                    <w:t xml:space="preserve">El 96% de los empleados tiene entre 20 y 52-72 años de edad. El intervalo teórico es de [16.48,52.72] </w:t>
                   </w:r>
                 </w:p>
               </w:tc>
@@ -5496,7 +5323,7 @@
               <w:trPr/>
               <w:tc>
                 <w:tcPr>
-                  <w:tcW w:w="1565" w:type="dxa"/>
+                  <w:tcW w:w="1564" w:type="dxa"/>
                   <w:tcBorders>
                     <w:top w:val="single" w:sz="4" w:space="0" w:color="000000"/>
                     <w:start w:val="single" w:sz="4" w:space="0" w:color="000000"/>
@@ -5522,7 +5349,7 @@
               </w:tc>
               <w:tc>
                 <w:tcPr>
-                  <w:tcW w:w="4129" w:type="dxa"/>
+                  <w:tcW w:w="4130" w:type="dxa"/>
                   <w:tcBorders>
                     <w:top w:val="single" w:sz="4" w:space="0" w:color="000000"/>
                     <w:start w:val="single" w:sz="4" w:space="0" w:color="000000"/>
@@ -5546,23 +5373,7 @@
                       <w:color w:val="202124"/>
                       <w:highlight w:val="white"/>
                     </w:rPr>
-                    <w:t>[</w:t>
-                  </w:r>
-                  <w:r>
-                    <w:rPr>
-                      <w:rFonts w:eastAsia="Arial" w:cs="Arial" w:ascii="Roboto" w:hAnsi="Roboto"/>
-                      <w:color w:val="202124"/>
-                      <w:highlight w:val="white"/>
-                    </w:rPr>
-                    <w:t>0 a 20,04</w:t>
-                  </w:r>
-                  <w:r>
-                    <w:rPr>
-                      <w:rFonts w:eastAsia="Arial" w:cs="Arial" w:ascii="Roboto" w:hAnsi="Roboto"/>
-                      <w:color w:val="202124"/>
-                      <w:highlight w:val="white"/>
-                    </w:rPr>
-                    <w:t>]</w:t>
+                    <w:t>[0 a 20,04]</w:t>
                   </w:r>
                 </w:p>
               </w:tc>
@@ -5591,63 +5402,7 @@
                       <w:color w:val="202124"/>
                       <w:highlight w:val="white"/>
                     </w:rPr>
-                    <w:t>El 9</w:t>
-                  </w:r>
-                  <w:r>
-                    <w:rPr>
-                      <w:rFonts w:eastAsia="Arial" w:cs="Arial" w:ascii="Roboto" w:hAnsi="Roboto"/>
-                      <w:color w:val="202124"/>
-                      <w:highlight w:val="white"/>
-                    </w:rPr>
-                    <w:t>4</w:t>
-                  </w:r>
-                  <w:r>
-                    <w:rPr>
-                      <w:rFonts w:eastAsia="Arial" w:cs="Arial" w:ascii="Roboto" w:hAnsi="Roboto"/>
-                      <w:color w:val="202124"/>
-                      <w:highlight w:val="white"/>
-                    </w:rPr>
-                    <w:t xml:space="preserve">% de los empleados </w:t>
-                  </w:r>
-                  <w:r>
-                    <w:rPr>
-                      <w:rFonts w:eastAsia="Arial" w:cs="Arial" w:ascii="Roboto" w:hAnsi="Roboto"/>
-                      <w:color w:val="202124"/>
-                      <w:highlight w:val="white"/>
-                    </w:rPr>
-                    <w:t>han</w:t>
-                  </w:r>
-                  <w:r>
-                    <w:rPr>
-                      <w:rFonts w:eastAsia="Arial" w:cs="Arial" w:ascii="Roboto" w:hAnsi="Roboto"/>
-                      <w:color w:val="202124"/>
-                      <w:highlight w:val="white"/>
-                    </w:rPr>
-                    <w:t xml:space="preserve"> trabajado entre 0 y 20,</w:t>
-                  </w:r>
-                  <w:r>
-                    <w:rPr>
-                      <w:rFonts w:eastAsia="Arial" w:cs="Arial" w:ascii="Roboto" w:hAnsi="Roboto"/>
-                      <w:color w:val="202124"/>
-                      <w:highlight w:val="white"/>
-                    </w:rPr>
-                    <w:t>04</w:t>
-                  </w:r>
-                  <w:r>
-                    <w:rPr>
-                      <w:rFonts w:eastAsia="Arial" w:cs="Arial" w:ascii="Roboto" w:hAnsi="Roboto"/>
-                      <w:color w:val="202124"/>
-                      <w:highlight w:val="white"/>
-                    </w:rPr>
-                    <w:t xml:space="preserve"> años en sus antiguos puestos, antes de estar  desempleados. </w:t>
-                  </w:r>
-                  <w:r>
-                    <w:rPr>
-                      <w:rFonts w:eastAsia="Arial" w:cs="Arial" w:ascii="Roboto" w:hAnsi="Roboto"/>
-                      <w:color w:val="202124"/>
-                      <w:highlight w:val="white"/>
-                    </w:rPr>
-                    <w:t xml:space="preserve">El intervalo teórico es [-3.328, 20.04] pero es un dato de tiempo se ajusta a 0 </w:t>
+                    <w:t xml:space="preserve">El 94% de los empleados han trabajado entre 0 y 20,04 años en sus antiguos puestos, antes de estar  desempleados. El intervalo teórico es [-3.328, 20.04] pero es un dato de tiempo se ajusta a 0 </w:t>
                   </w:r>
                 </w:p>
               </w:tc>
@@ -5758,8 +5513,8 @@
         <w:tblLook w:noHBand="0" w:noVBand="1" w:firstColumn="0" w:lastRow="0" w:lastColumn="0" w:firstRow="0" w:val="0400"/>
       </w:tblPr>
       <w:tblGrid>
-        <w:gridCol w:w="1611"/>
-        <w:gridCol w:w="2487"/>
+        <w:gridCol w:w="1610"/>
+        <w:gridCol w:w="2488"/>
         <w:gridCol w:w="6267"/>
       </w:tblGrid>
       <w:tr>
@@ -5768,7 +5523,7 @@
         </w:trPr>
         <w:tc>
           <w:tcPr>
-            <w:tcW w:w="1611" w:type="dxa"/>
+            <w:tcW w:w="1610" w:type="dxa"/>
             <w:tcBorders>
               <w:top w:val="single" w:sz="4" w:space="0" w:color="000000"/>
               <w:start w:val="single" w:sz="4" w:space="0" w:color="000000"/>
@@ -5800,7 +5555,7 @@
         </w:tc>
         <w:tc>
           <w:tcPr>
-            <w:tcW w:w="2487" w:type="dxa"/>
+            <w:tcW w:w="2488" w:type="dxa"/>
             <w:tcBorders>
               <w:top w:val="single" w:sz="4" w:space="0" w:color="000000"/>
               <w:start w:val="single" w:sz="4" w:space="0" w:color="000000"/>
@@ -5869,7 +5624,7 @@
         </w:trPr>
         <w:tc>
           <w:tcPr>
-            <w:tcW w:w="1611" w:type="dxa"/>
+            <w:tcW w:w="1610" w:type="dxa"/>
             <w:tcBorders>
               <w:top w:val="single" w:sz="4" w:space="0" w:color="000000"/>
               <w:start w:val="single" w:sz="4" w:space="0" w:color="000000"/>
@@ -5899,7 +5654,7 @@
         </w:tc>
         <w:tc>
           <w:tcPr>
-            <w:tcW w:w="2487" w:type="dxa"/>
+            <w:tcW w:w="2488" w:type="dxa"/>
             <w:tcBorders>
               <w:top w:val="single" w:sz="4" w:space="0" w:color="000000"/>
               <w:start w:val="single" w:sz="4" w:space="0" w:color="000000"/>
@@ -5952,151 +5707,7 @@
                 <w:color w:val="202124"/>
                 <w:highlight w:val="white"/>
               </w:rPr>
-              <w:t>La moda es de 1</w:t>
-            </w:r>
-            <w:r>
-              <w:rPr>
-                <w:rFonts w:eastAsia="Arial" w:cs="Arial" w:ascii="Roboto" w:hAnsi="Roboto"/>
-                <w:color w:val="202124"/>
-                <w:highlight w:val="white"/>
-              </w:rPr>
-              <w:t xml:space="preserve">5 </w:t>
-            </w:r>
-            <w:r>
-              <w:rPr>
-                <w:rFonts w:eastAsia="Arial" w:cs="Arial" w:ascii="Roboto" w:hAnsi="Roboto"/>
-                <w:color w:val="202124"/>
-                <w:highlight w:val="white"/>
-              </w:rPr>
-              <w:t>años de estudios (</w:t>
-            </w:r>
-            <w:r>
-              <w:rPr>
-                <w:rFonts w:eastAsia="Arial" w:cs="Arial" w:ascii="Roboto" w:hAnsi="Roboto"/>
-                <w:color w:val="202124"/>
-                <w:highlight w:val="white"/>
-              </w:rPr>
-              <w:t>9</w:t>
-            </w:r>
-            <w:r>
-              <w:rPr>
-                <w:rFonts w:eastAsia="Arial" w:cs="Arial" w:ascii="Roboto" w:hAnsi="Roboto"/>
-                <w:color w:val="202124"/>
-                <w:highlight w:val="white"/>
-              </w:rPr>
-              <w:t xml:space="preserve"> empleados </w:t>
-            </w:r>
-            <w:r>
-              <w:rPr>
-                <w:rFonts w:eastAsia="Arial" w:cs="Arial" w:ascii="Roboto" w:hAnsi="Roboto"/>
-                <w:color w:val="202124"/>
-                <w:highlight w:val="white"/>
-              </w:rPr>
-              <w:t>18</w:t>
-            </w:r>
-            <w:r>
-              <w:rPr>
-                <w:rFonts w:eastAsia="Arial" w:cs="Arial" w:ascii="Roboto" w:hAnsi="Roboto"/>
-                <w:color w:val="202124"/>
-                <w:highlight w:val="white"/>
-              </w:rPr>
-              <w:t xml:space="preserve">% del total). Le siguen </w:t>
-            </w:r>
-            <w:r>
-              <w:rPr>
-                <w:rFonts w:eastAsia="Arial" w:cs="Arial" w:ascii="Roboto" w:hAnsi="Roboto"/>
-                <w:color w:val="202124"/>
-                <w:highlight w:val="white"/>
-              </w:rPr>
-              <w:t>13</w:t>
-            </w:r>
-            <w:r>
-              <w:rPr>
-                <w:rFonts w:eastAsia="Arial" w:cs="Arial" w:ascii="Roboto" w:hAnsi="Roboto"/>
-                <w:color w:val="202124"/>
-                <w:highlight w:val="white"/>
-              </w:rPr>
-              <w:t xml:space="preserve"> años (</w:t>
-            </w:r>
-            <w:r>
-              <w:rPr>
-                <w:rFonts w:eastAsia="Arial" w:cs="Arial" w:ascii="Roboto" w:hAnsi="Roboto"/>
-                <w:color w:val="202124"/>
-                <w:highlight w:val="white"/>
-              </w:rPr>
-              <w:t>8</w:t>
-            </w:r>
-            <w:r>
-              <w:rPr>
-                <w:rFonts w:eastAsia="Arial" w:cs="Arial" w:ascii="Roboto" w:hAnsi="Roboto"/>
-                <w:color w:val="202124"/>
-                <w:highlight w:val="white"/>
-              </w:rPr>
-              <w:t xml:space="preserve"> empleados, 1</w:t>
-            </w:r>
-            <w:r>
-              <w:rPr>
-                <w:rFonts w:eastAsia="Arial" w:cs="Arial" w:ascii="Roboto" w:hAnsi="Roboto"/>
-                <w:color w:val="202124"/>
-                <w:highlight w:val="white"/>
-              </w:rPr>
-              <w:t>6</w:t>
-            </w:r>
-            <w:r>
-              <w:rPr>
-                <w:rFonts w:eastAsia="Arial" w:cs="Arial" w:ascii="Roboto" w:hAnsi="Roboto"/>
-                <w:color w:val="202124"/>
-                <w:highlight w:val="white"/>
-              </w:rPr>
-              <w:t>%) y 1</w:t>
-            </w:r>
-            <w:r>
-              <w:rPr>
-                <w:rFonts w:eastAsia="Arial" w:cs="Arial" w:ascii="Roboto" w:hAnsi="Roboto"/>
-                <w:color w:val="202124"/>
-                <w:highlight w:val="white"/>
-              </w:rPr>
-              <w:t>2</w:t>
-            </w:r>
-            <w:r>
-              <w:rPr>
-                <w:rFonts w:eastAsia="Arial" w:cs="Arial" w:ascii="Roboto" w:hAnsi="Roboto"/>
-                <w:color w:val="202124"/>
-                <w:highlight w:val="white"/>
-              </w:rPr>
-              <w:t xml:space="preserve"> años (</w:t>
-            </w:r>
-            <w:r>
-              <w:rPr>
-                <w:rFonts w:eastAsia="Arial" w:cs="Arial" w:ascii="Roboto" w:hAnsi="Roboto"/>
-                <w:color w:val="202124"/>
-                <w:highlight w:val="white"/>
-              </w:rPr>
-              <w:t>6</w:t>
-            </w:r>
-            <w:r>
-              <w:rPr>
-                <w:rFonts w:eastAsia="Arial" w:cs="Arial" w:ascii="Roboto" w:hAnsi="Roboto"/>
-                <w:color w:val="202124"/>
-                <w:highlight w:val="white"/>
-              </w:rPr>
-              <w:t xml:space="preserve"> empleados, 1</w:t>
-            </w:r>
-            <w:r>
-              <w:rPr>
-                <w:rFonts w:eastAsia="Arial" w:cs="Arial" w:ascii="Roboto" w:hAnsi="Roboto"/>
-                <w:color w:val="202124"/>
-                <w:highlight w:val="white"/>
-              </w:rPr>
-              <w:t>2</w:t>
-            </w:r>
-            <w:r>
-              <w:rPr>
-                <w:rFonts w:eastAsia="Arial" w:cs="Arial" w:ascii="Roboto" w:hAnsi="Roboto"/>
-                <w:color w:val="202124"/>
-                <w:highlight w:val="white"/>
-              </w:rPr>
-              <w:t>%) La mayoría entre 12 y 15 años de estudio</w:t>
+              <w:t>La moda es de 15 años de estudios (9 empleados 18% del total). Le siguen 13 años (8 empleados, 16%) y 12 años (6 empleados, 12%) La mayoría entre 12 y 15 años de estudio</w:t>
             </w:r>
           </w:p>
         </w:tc>
@@ -6107,7 +5718,7 @@
         </w:trPr>
         <w:tc>
           <w:tcPr>
-            <w:tcW w:w="1611" w:type="dxa"/>
+            <w:tcW w:w="1610" w:type="dxa"/>
             <w:tcBorders>
               <w:top w:val="single" w:sz="4" w:space="0" w:color="000000"/>
               <w:start w:val="single" w:sz="4" w:space="0" w:color="000000"/>
@@ -6137,7 +5748,7 @@
         </w:tc>
         <w:tc>
           <w:tcPr>
-            <w:tcW w:w="2487" w:type="dxa"/>
+            <w:tcW w:w="2488" w:type="dxa"/>
             <w:tcBorders>
               <w:top w:val="single" w:sz="4" w:space="0" w:color="000000"/>
               <w:start w:val="single" w:sz="4" w:space="0" w:color="000000"/>
@@ -6190,71 +5801,7 @@
                 <w:color w:val="202124"/>
                 <w:highlight w:val="white"/>
               </w:rPr>
-              <w:t>Con este medida podemos ver % de casado en este caso el 7</w:t>
-            </w:r>
-            <w:r>
-              <w:rPr>
-                <w:rFonts w:eastAsia="Arial" w:cs="Arial" w:ascii="Roboto" w:hAnsi="Roboto"/>
-                <w:color w:val="202124"/>
-                <w:highlight w:val="white"/>
-              </w:rPr>
-              <w:t>0</w:t>
-            </w:r>
-            <w:r>
-              <w:rPr>
-                <w:rFonts w:eastAsia="Arial" w:cs="Arial" w:ascii="Roboto" w:hAnsi="Roboto"/>
-                <w:color w:val="202124"/>
-                <w:highlight w:val="white"/>
-              </w:rPr>
-              <w:t>% casados (3</w:t>
-            </w:r>
-            <w:r>
-              <w:rPr>
-                <w:rFonts w:eastAsia="Arial" w:cs="Arial" w:ascii="Roboto" w:hAnsi="Roboto"/>
-                <w:color w:val="202124"/>
-                <w:highlight w:val="white"/>
-              </w:rPr>
-              <w:t>5</w:t>
-            </w:r>
-            <w:r>
-              <w:rPr>
-                <w:rFonts w:eastAsia="Arial" w:cs="Arial" w:ascii="Roboto" w:hAnsi="Roboto"/>
-                <w:color w:val="202124"/>
-                <w:highlight w:val="white"/>
-              </w:rPr>
-              <w:t xml:space="preserve">) </w:t>
-            </w:r>
-            <w:r>
-              <w:rPr>
-                <w:rFonts w:eastAsia="Arial" w:cs="Arial" w:ascii="Roboto" w:hAnsi="Roboto"/>
-                <w:color w:val="202124"/>
-                <w:highlight w:val="white"/>
-              </w:rPr>
-              <w:t>30</w:t>
-            </w:r>
-            <w:r>
-              <w:rPr>
-                <w:rFonts w:eastAsia="Arial" w:cs="Arial" w:ascii="Roboto" w:hAnsi="Roboto"/>
-                <w:color w:val="202124"/>
-                <w:highlight w:val="white"/>
-              </w:rPr>
-              <w:t>% solteros (1</w:t>
-            </w:r>
-            <w:r>
-              <w:rPr>
-                <w:rFonts w:eastAsia="Arial" w:cs="Arial" w:ascii="Roboto" w:hAnsi="Roboto"/>
-                <w:color w:val="202124"/>
-                <w:highlight w:val="white"/>
-              </w:rPr>
-              <w:t>5</w:t>
-            </w:r>
-            <w:r>
-              <w:rPr>
-                <w:rFonts w:eastAsia="Arial" w:cs="Arial" w:ascii="Roboto" w:hAnsi="Roboto"/>
-                <w:color w:val="202124"/>
-                <w:highlight w:val="white"/>
-              </w:rPr>
-              <w:t>). La moda es 1  la mayoría son casados</w:t>
+              <w:t>Con este medida podemos ver % de casado en este caso el 70% casados (35) 30% solteros (15). La moda es 1  la mayoría son casados</w:t>
             </w:r>
           </w:p>
         </w:tc>
@@ -6265,7 +5812,7 @@
         </w:trPr>
         <w:tc>
           <w:tcPr>
-            <w:tcW w:w="1611" w:type="dxa"/>
+            <w:tcW w:w="1610" w:type="dxa"/>
             <w:tcBorders>
               <w:start w:val="single" w:sz="4" w:space="0" w:color="000000"/>
               <w:bottom w:val="single" w:sz="4" w:space="0" w:color="000000"/>
@@ -6294,7 +5841,7 @@
         </w:tc>
         <w:tc>
           <w:tcPr>
-            <w:tcW w:w="2487" w:type="dxa"/>
+            <w:tcW w:w="2488" w:type="dxa"/>
             <w:tcBorders>
               <w:start w:val="single" w:sz="4" w:space="0" w:color="000000"/>
               <w:bottom w:val="single" w:sz="4" w:space="0" w:color="000000"/>
@@ -6317,15 +5864,7 @@
                 <w:color w:val="202124"/>
                 <w:highlight w:val="white"/>
               </w:rPr>
-              <w:t xml:space="preserve">Frecuencia relativa, </w:t>
-            </w:r>
-            <w:r>
-              <w:rPr>
-                <w:rFonts w:eastAsia="Arial" w:cs="Arial" w:ascii="Roboto" w:hAnsi="Roboto"/>
-                <w:color w:val="202124"/>
-                <w:highlight w:val="white"/>
-              </w:rPr>
-              <w:t>moda</w:t>
+              <w:t>Frecuencia relativa, moda</w:t>
             </w:r>
           </w:p>
         </w:tc>
@@ -6353,71 +5892,7 @@
                 <w:color w:val="202124"/>
                 <w:highlight w:val="white"/>
               </w:rPr>
-              <w:t xml:space="preserve">Con este medida podemos ver % de empleados que son cabeza de familia en este caso el </w:t>
-            </w:r>
-            <w:r>
-              <w:rPr>
-                <w:rFonts w:eastAsia="Arial" w:cs="Arial" w:ascii="Roboto" w:hAnsi="Roboto"/>
-                <w:color w:val="202124"/>
-                <w:highlight w:val="white"/>
-              </w:rPr>
-              <w:t>68</w:t>
-            </w:r>
-            <w:r>
-              <w:rPr>
-                <w:rFonts w:eastAsia="Arial" w:cs="Arial" w:ascii="Roboto" w:hAnsi="Roboto"/>
-                <w:color w:val="202124"/>
-                <w:highlight w:val="white"/>
-              </w:rPr>
-              <w:t>% (</w:t>
-            </w:r>
-            <w:r>
-              <w:rPr>
-                <w:rFonts w:eastAsia="Arial" w:cs="Arial" w:ascii="Roboto" w:hAnsi="Roboto"/>
-                <w:color w:val="202124"/>
-                <w:highlight w:val="white"/>
-              </w:rPr>
-              <w:t>34</w:t>
-            </w:r>
-            <w:r>
-              <w:rPr>
-                <w:rFonts w:eastAsia="Arial" w:cs="Arial" w:ascii="Roboto" w:hAnsi="Roboto"/>
-                <w:color w:val="202124"/>
-                <w:highlight w:val="white"/>
-              </w:rPr>
-              <w:t xml:space="preserve"> empleados) son cabeza de familia, mientras el </w:t>
-            </w:r>
-            <w:r>
-              <w:rPr>
-                <w:rFonts w:eastAsia="Arial" w:cs="Arial" w:ascii="Roboto" w:hAnsi="Roboto"/>
-                <w:color w:val="202124"/>
-                <w:highlight w:val="white"/>
-              </w:rPr>
-              <w:t>32</w:t>
-            </w:r>
-            <w:r>
-              <w:rPr>
-                <w:rFonts w:eastAsia="Arial" w:cs="Arial" w:ascii="Roboto" w:hAnsi="Roboto"/>
-                <w:color w:val="202124"/>
-                <w:highlight w:val="white"/>
-              </w:rPr>
-              <w:t>% (1</w:t>
-            </w:r>
-            <w:r>
-              <w:rPr>
-                <w:rFonts w:eastAsia="Arial" w:cs="Arial" w:ascii="Roboto" w:hAnsi="Roboto"/>
-                <w:color w:val="202124"/>
-                <w:highlight w:val="white"/>
-              </w:rPr>
-              <w:t>6</w:t>
-            </w:r>
-            <w:r>
-              <w:rPr>
-                <w:rFonts w:eastAsia="Arial" w:cs="Arial" w:ascii="Roboto" w:hAnsi="Roboto"/>
-                <w:color w:val="202124"/>
-                <w:highlight w:val="white"/>
-              </w:rPr>
-              <w:t xml:space="preserve"> empleados) no lo son. La moda es Si, la mayoría son cabeza de familia</w:t>
+              <w:t>Con este medida podemos ver % de empleados que son cabeza de familia en este caso el 68% (34 empleados) son cabeza de familia, mientras el 32% (16 empleados) no lo son. La moda es Si, la mayoría son cabeza de familia</w:t>
             </w:r>
           </w:p>
         </w:tc>
@@ -6428,7 +5903,7 @@
         </w:trPr>
         <w:tc>
           <w:tcPr>
-            <w:tcW w:w="1611" w:type="dxa"/>
+            <w:tcW w:w="1610" w:type="dxa"/>
             <w:tcBorders>
               <w:start w:val="single" w:sz="4" w:space="0" w:color="000000"/>
               <w:bottom w:val="single" w:sz="4" w:space="0" w:color="000000"/>
@@ -6457,7 +5932,7 @@
         </w:tc>
         <w:tc>
           <w:tcPr>
-            <w:tcW w:w="2487" w:type="dxa"/>
+            <w:tcW w:w="2488" w:type="dxa"/>
             <w:tcBorders>
               <w:start w:val="single" w:sz="4" w:space="0" w:color="000000"/>
               <w:bottom w:val="single" w:sz="4" w:space="0" w:color="000000"/>
@@ -6480,15 +5955,7 @@
                 <w:color w:val="202124"/>
                 <w:highlight w:val="white"/>
               </w:rPr>
-              <w:t xml:space="preserve">Frecuencia relativa, </w:t>
-            </w:r>
-            <w:r>
-              <w:rPr>
-                <w:rFonts w:eastAsia="Arial" w:cs="Arial" w:ascii="Roboto" w:hAnsi="Roboto"/>
-                <w:color w:val="202124"/>
-                <w:highlight w:val="white"/>
-              </w:rPr>
-              <w:t>moda</w:t>
+              <w:t>Frecuencia relativa, moda</w:t>
             </w:r>
           </w:p>
         </w:tc>
@@ -6516,127 +5983,7 @@
                 <w:color w:val="202124"/>
                 <w:highlight w:val="white"/>
               </w:rPr>
-              <w:t xml:space="preserve">Con este medida podemos ver % de empleados administradores, el </w:t>
-            </w:r>
-            <w:r>
-              <w:rPr>
-                <w:rFonts w:eastAsia="Arial" w:cs="Arial" w:ascii="Roboto" w:hAnsi="Roboto"/>
-                <w:color w:val="202124"/>
-                <w:highlight w:val="white"/>
-              </w:rPr>
-              <w:t>10</w:t>
-            </w:r>
-            <w:r>
-              <w:rPr>
-                <w:rFonts w:eastAsia="Arial" w:cs="Arial" w:ascii="Roboto" w:hAnsi="Roboto"/>
-                <w:color w:val="202124"/>
-                <w:highlight w:val="white"/>
-              </w:rPr>
-              <w:t>% (</w:t>
-            </w:r>
-            <w:r>
-              <w:rPr>
-                <w:rFonts w:eastAsia="Arial" w:cs="Arial" w:ascii="Roboto" w:hAnsi="Roboto"/>
-                <w:color w:val="202124"/>
-                <w:highlight w:val="white"/>
-              </w:rPr>
-              <w:t>5</w:t>
-            </w:r>
-            <w:r>
-              <w:rPr>
-                <w:rFonts w:eastAsia="Arial" w:cs="Arial" w:ascii="Roboto" w:hAnsi="Roboto"/>
-                <w:color w:val="202124"/>
-                <w:highlight w:val="white"/>
-              </w:rPr>
-              <w:t xml:space="preserve"> empleados) </w:t>
-            </w:r>
-            <w:r>
-              <w:rPr>
-                <w:rFonts w:eastAsia="Arial" w:cs="Arial" w:ascii="Roboto" w:hAnsi="Roboto"/>
-                <w:color w:val="202124"/>
-                <w:highlight w:val="white"/>
-              </w:rPr>
-              <w:t>Si</w:t>
-            </w:r>
-            <w:r>
-              <w:rPr>
-                <w:rFonts w:eastAsia="Arial" w:cs="Arial" w:ascii="Roboto" w:hAnsi="Roboto"/>
-                <w:color w:val="202124"/>
-                <w:highlight w:val="white"/>
-              </w:rPr>
-              <w:t xml:space="preserve"> son administradores </w:t>
-            </w:r>
-            <w:r>
-              <w:rPr>
-                <w:rFonts w:eastAsia="Arial" w:cs="Arial" w:ascii="Roboto" w:hAnsi="Roboto"/>
-                <w:color w:val="202124"/>
-                <w:highlight w:val="white"/>
-              </w:rPr>
-              <w:t>y</w:t>
-            </w:r>
-            <w:r>
-              <w:rPr>
-                <w:rFonts w:eastAsia="Arial" w:cs="Arial" w:ascii="Roboto" w:hAnsi="Roboto"/>
-                <w:color w:val="202124"/>
-                <w:highlight w:val="white"/>
-              </w:rPr>
-              <w:t xml:space="preserve"> el </w:t>
-            </w:r>
-            <w:r>
-              <w:rPr>
-                <w:rFonts w:eastAsia="Arial" w:cs="Arial" w:ascii="Roboto" w:hAnsi="Roboto"/>
-                <w:color w:val="202124"/>
-                <w:highlight w:val="white"/>
-              </w:rPr>
-              <w:t>90</w:t>
-            </w:r>
-            <w:r>
-              <w:rPr>
-                <w:rFonts w:eastAsia="Arial" w:cs="Arial" w:ascii="Roboto" w:hAnsi="Roboto"/>
-                <w:color w:val="202124"/>
-                <w:highlight w:val="white"/>
-              </w:rPr>
-              <w:t>%(</w:t>
-            </w:r>
-            <w:r>
-              <w:rPr>
-                <w:rFonts w:eastAsia="Arial" w:cs="Arial" w:ascii="Roboto" w:hAnsi="Roboto"/>
-                <w:color w:val="202124"/>
-                <w:highlight w:val="white"/>
-              </w:rPr>
-              <w:t>95</w:t>
-            </w:r>
-            <w:r>
-              <w:rPr>
-                <w:rFonts w:eastAsia="Arial" w:cs="Arial" w:ascii="Roboto" w:hAnsi="Roboto"/>
-                <w:color w:val="202124"/>
-                <w:highlight w:val="white"/>
-              </w:rPr>
-              <w:t xml:space="preserve"> empleados) </w:t>
-            </w:r>
-            <w:r>
-              <w:rPr>
-                <w:rFonts w:eastAsia="Arial" w:cs="Arial" w:ascii="Roboto" w:hAnsi="Roboto"/>
-                <w:color w:val="202124"/>
-                <w:highlight w:val="white"/>
-              </w:rPr>
-              <w:t>No lo son</w:t>
-            </w:r>
-            <w:r>
-              <w:rPr>
-                <w:rFonts w:eastAsia="Arial" w:cs="Arial" w:ascii="Roboto" w:hAnsi="Roboto"/>
-                <w:color w:val="202124"/>
-                <w:highlight w:val="white"/>
-              </w:rPr>
-              <w:t xml:space="preserve">. La moda es No, la </w:t>
-            </w:r>
-            <w:r>
-              <w:rPr>
-                <w:rFonts w:eastAsia="Arial" w:cs="Arial" w:ascii="Roboto" w:hAnsi="Roboto"/>
-                <w:color w:val="202124"/>
-                <w:highlight w:val="white"/>
-              </w:rPr>
-              <w:t xml:space="preserve">mayoría no son administradores </w:t>
+              <w:t xml:space="preserve">Con este medida podemos ver % de empleados administradores, el 10% (5 empleados) Si son administradores y el 90%(95 empleados) No lo son. La moda es No, la mayoría no son administradores </w:t>
             </w:r>
           </w:p>
         </w:tc>
@@ -6647,7 +5994,7 @@
         </w:trPr>
         <w:tc>
           <w:tcPr>
-            <w:tcW w:w="1611" w:type="dxa"/>
+            <w:tcW w:w="1610" w:type="dxa"/>
             <w:tcBorders>
               <w:start w:val="single" w:sz="4" w:space="0" w:color="000000"/>
               <w:bottom w:val="single" w:sz="4" w:space="0" w:color="000000"/>
@@ -6676,7 +6023,7 @@
         </w:tc>
         <w:tc>
           <w:tcPr>
-            <w:tcW w:w="2487" w:type="dxa"/>
+            <w:tcW w:w="2488" w:type="dxa"/>
             <w:tcBorders>
               <w:start w:val="single" w:sz="4" w:space="0" w:color="000000"/>
               <w:bottom w:val="single" w:sz="4" w:space="0" w:color="000000"/>
@@ -6699,15 +6046,7 @@
                 <w:color w:val="202124"/>
                 <w:highlight w:val="white"/>
               </w:rPr>
-              <w:t xml:space="preserve">Frecuencia relativa, </w:t>
-            </w:r>
-            <w:r>
-              <w:rPr>
-                <w:rFonts w:eastAsia="Arial" w:cs="Arial" w:ascii="Roboto" w:hAnsi="Roboto"/>
-                <w:color w:val="202124"/>
-                <w:highlight w:val="white"/>
-              </w:rPr>
-              <w:t>moda</w:t>
+              <w:t>Frecuencia relativa, moda</w:t>
             </w:r>
           </w:p>
         </w:tc>
@@ -6735,15 +6074,7 @@
                 <w:color w:val="202124"/>
                 <w:highlight w:val="white"/>
               </w:rPr>
-              <w:t xml:space="preserve">Con este medida podemos ver % de empleados </w:t>
-            </w:r>
-            <w:r>
-              <w:rPr>
-                <w:rFonts w:eastAsia="Arial" w:cs="Arial" w:ascii="Roboto" w:hAnsi="Roboto"/>
-                <w:color w:val="202124"/>
-                <w:highlight w:val="white"/>
-              </w:rPr>
-              <w:t>que son de ventas el 18%(9 empleados) Si trabajaron en ventas. El 82% (41 empleados) si lo hicieron. La moda es no, la mayoría no trabajo en ventas.</w:t>
+              <w:t>Con este medida podemos ver % de empleados que son de ventas el 18%(9 empleados) Si trabajaron en ventas. El 82% (41 empleados) si lo hicieron. La moda es no, la mayoría no trabajo en ventas.</w:t>
             </w:r>
           </w:p>
         </w:tc>
@@ -6847,7 +6178,11 @@
               </w:rPr>
             </w:pPr>
             <w:r>
-              <w:rPr/>
+              <w:rPr>
+                <w:rFonts w:eastAsia="Arial" w:cs="Arial" w:ascii="Roboto" w:hAnsi="Roboto"/>
+                <w:color w:val="B7B7B7"/>
+                <w:highlight w:val="white"/>
+              </w:rPr>
             </w:r>
           </w:p>
           <w:p>
@@ -6878,8 +6213,25 @@
                 <w:sz w:val="24"/>
                 <w:highlight w:val="white"/>
               </w:rPr>
-              <w:t xml:space="preserve">Análisis del desempleo </w:t>
-            </w:r>
+              <w:t>Análisis del desempleo de la industria manufacturera</w:t>
+            </w:r>
+          </w:p>
+          <w:p>
+            <w:pPr>
+              <w:pStyle w:val="Normal"/>
+              <w:jc w:val="start"/>
+              <w:rPr>
+                <w:rFonts w:ascii="adelle-sans;sans-serif" w:hAnsi="adelle-sans;sans-serif" w:eastAsia="Arial" w:cs="Arial"/>
+                <w:b w:val="false"/>
+                <w:i w:val="false"/>
+                <w:caps w:val="false"/>
+                <w:smallCaps w:val="false"/>
+                <w:color w:val="000000"/>
+                <w:spacing w:val="0"/>
+                <w:sz w:val="24"/>
+                <w:highlight w:val="white"/>
+              </w:rPr>
+            </w:pPr>
             <w:r>
               <w:rPr>
                 <w:rFonts w:eastAsia="Arial" w:cs="Arial" w:ascii="adelle-sans;sans-serif" w:hAnsi="adelle-sans;sans-serif"/>
@@ -6892,7 +6244,7 @@
                 <w:sz w:val="24"/>
                 <w:highlight w:val="white"/>
               </w:rPr>
-              <w:t>de la industria manufacturera</w:t>
+              <w:t>Autor: Jesus Abel Vera Cruz</w:t>
             </w:r>
           </w:p>
           <w:p>
@@ -6923,7 +6275,7 @@
                 <w:sz w:val="24"/>
                 <w:highlight w:val="white"/>
               </w:rPr>
-              <w:t>Autor: Jesus Abel Vera Cruz</w:t>
+              <w:t>Fecha: 24 septiembre 2026</w:t>
             </w:r>
           </w:p>
           <w:p>
@@ -6954,37 +6306,6 @@
                 <w:sz w:val="24"/>
                 <w:highlight w:val="white"/>
               </w:rPr>
-              <w:t>Fecha: 24 septiembre 2026</w:t>
-            </w:r>
-          </w:p>
-          <w:p>
-            <w:pPr>
-              <w:pStyle w:val="Normal"/>
-              <w:jc w:val="start"/>
-              <w:rPr>
-                <w:rFonts w:ascii="adelle-sans;sans-serif" w:hAnsi="adelle-sans;sans-serif" w:eastAsia="Arial" w:cs="Arial"/>
-                <w:b w:val="false"/>
-                <w:i w:val="false"/>
-                <w:caps w:val="false"/>
-                <w:smallCaps w:val="false"/>
-                <w:color w:val="000000"/>
-                <w:spacing w:val="0"/>
-                <w:sz w:val="24"/>
-                <w:highlight w:val="white"/>
-              </w:rPr>
-            </w:pPr>
-            <w:r>
-              <w:rPr>
-                <w:rFonts w:eastAsia="Arial" w:cs="Arial" w:ascii="adelle-sans;sans-serif" w:hAnsi="adelle-sans;sans-serif"/>
-                <w:b w:val="false"/>
-                <w:i w:val="false"/>
-                <w:caps w:val="false"/>
-                <w:smallCaps w:val="false"/>
-                <w:color w:val="000000"/>
-                <w:spacing w:val="0"/>
-                <w:sz w:val="24"/>
-                <w:highlight w:val="white"/>
-              </w:rPr>
             </w:r>
           </w:p>
           <w:p>
@@ -7021,31 +6342,97 @@
                 <w:color w:val="auto"/>
                 <w:highlight w:val="white"/>
               </w:rPr>
-              <w:t>El presente análisis describe el comportamiento de las variables asociadas al desempleo en una muestra de 50 empleados de la industria manufacturera. Se analizaron 3 variables cuantitativas (Semanas de desempleo, Edad, Años en el trabajo anterior) y 5 cualitativas (Educación, Casado, Cabeza de familia, Ventas). Los datos fueron proporcionados en un archivo de Excel. Los hallazgos principales indicad que el promedio de sem</w:t>
-            </w:r>
-            <w:r>
-              <w:rPr>
-                <w:rFonts w:eastAsia="Arial" w:cs="Arial" w:ascii="Roboto" w:hAnsi="Roboto"/>
+              <w:t>El presente análisis describe el comportamiento de las variables asociadas al desempleo en una muestra de 50 empleados de la industria manufacturera. Se analizaron 3 variables cuantitativas (Semanas de desempleo, Edad, Años en el trabajo anterior) y 5 cualitativas (Educación, Casado, Cabeza de familia, Ventas). Los datos fueron proporcionados en un archivo de Excel. Los hallazgos principales indicad que el promedio de semanas de desempleo es de 43.36 semanas, con median de 39.5. Las tres variables cuantitativas presentan sesgo positivo y hay evidencia que no siguen distribución Normal. El 70% de los empleado esta caso  y el 68% son cabeza de familia. Al ser una muestra de la industria manufacturera solo el 10% de los despedidos de toda la muestra eran parte de la parte administrativa y 18% de toda la muestra a ventas. Se aplico Teorema de Chebyshev para determinar intervalos de confianza.</w:t>
+            </w:r>
+          </w:p>
+          <w:p>
+            <w:pPr>
+              <w:pStyle w:val="Normal"/>
+              <w:rPr>
+                <w:rFonts w:ascii="Roboto" w:hAnsi="Roboto" w:eastAsia="Arial" w:cs="Arial"/>
+                <w:color w:val="B7B7B7"/>
+                <w:highlight w:val="white"/>
+              </w:rPr>
+            </w:pPr>
+            <w:r>
+              <w:rPr>
+                <w:rFonts w:eastAsia="Arial" w:cs="Arial" w:ascii="Roboto" w:hAnsi="Roboto"/>
+                <w:color w:val="B7B7B7"/>
+                <w:highlight w:val="white"/>
+              </w:rPr>
+            </w:r>
+          </w:p>
+          <w:p>
+            <w:pPr>
+              <w:pStyle w:val="Normal"/>
+              <w:rPr>
+                <w:rFonts w:ascii="Roboto" w:hAnsi="Roboto" w:eastAsia="Arial" w:cs="Arial"/>
+                <w:color w:val="B7B7B7"/>
+                <w:highlight w:val="white"/>
+              </w:rPr>
+            </w:pPr>
+            <w:r>
+              <w:rPr>
+                <w:rFonts w:eastAsia="Arial" w:cs="Arial" w:ascii="Roboto" w:hAnsi="Roboto"/>
+                <w:color w:val="B7B7B7"/>
+                <w:highlight w:val="white"/>
+              </w:rPr>
+              <w:t>Introducción</w:t>
+            </w:r>
+          </w:p>
+          <w:p>
+            <w:pPr>
+              <w:pStyle w:val="Normal"/>
+              <w:jc w:val="both"/>
+              <w:rPr>
+                <w:rFonts w:ascii="Roboto" w:hAnsi="Roboto" w:eastAsia="Arial" w:cs="Arial"/>
                 <w:color w:val="auto"/>
                 <w:highlight w:val="white"/>
               </w:rPr>
-              <w:t>a</w:t>
-            </w:r>
+            </w:pPr>
             <w:r>
               <w:rPr>
                 <w:rFonts w:eastAsia="Arial" w:cs="Arial" w:ascii="Roboto" w:hAnsi="Roboto"/>
                 <w:color w:val="auto"/>
                 <w:highlight w:val="white"/>
               </w:rPr>
-              <w:t>nas de desempleo es de 43.36 semanas, con median de 39.5. Las tres variables cuantitativas presentan sesgo positivo y hay evidencia que no siguen distribución Normal. El 70% de los empleado esta caso  y el 68% son cabeza de familia. Al ser una muestra de la industria manu</w:t>
-            </w:r>
-            <w:r>
-              <w:rPr>
-                <w:rFonts w:eastAsia="Arial" w:cs="Arial" w:ascii="Roboto" w:hAnsi="Roboto"/>
+              <w:t>El estudio del fenómeno del desempleo es un trabajo importante para los gobiernos e industria porque se ha convertido en un indicador de crecimiento económico importante. En pocas palabras, a mayor desempleo, menor crecimiento económico. Esta es una medida casi universal en cualquier sociedad moderna. Las consecuencias del desempleo son bastantes claras para todos, por eso el estudio de las causas toma un papel relevante, por que permite generar políticas publicas y privadas para mitigar este indice. Este análisis considera variables que definen el número de semanas de desempleo en trabajadores de la industria manufacturera, utilizando estadística descriptiva para identificar, patrones, valores atípicos y distribuciones.</w:t>
+            </w:r>
+          </w:p>
+          <w:p>
+            <w:pPr>
+              <w:pStyle w:val="Normal"/>
+              <w:rPr>
+                <w:rFonts w:ascii="Roboto" w:hAnsi="Roboto" w:eastAsia="Arial" w:cs="Arial"/>
+                <w:color w:val="B7B7B7"/>
+                <w:highlight w:val="white"/>
+              </w:rPr>
+            </w:pPr>
+            <w:r>
+              <w:rPr>
+                <w:rFonts w:eastAsia="Arial" w:cs="Arial" w:ascii="Roboto" w:hAnsi="Roboto"/>
+                <w:color w:val="B7B7B7"/>
+                <w:highlight w:val="white"/>
+              </w:rPr>
+              <w:t>Método</w:t>
+            </w:r>
+          </w:p>
+          <w:p>
+            <w:pPr>
+              <w:pStyle w:val="Normal"/>
+              <w:rPr>
+                <w:rFonts w:ascii="Roboto" w:hAnsi="Roboto" w:eastAsia="Arial" w:cs="Arial"/>
                 <w:color w:val="auto"/>
                 <w:highlight w:val="white"/>
               </w:rPr>
-              <w:t>facturera solo el 10% de los despedidos de toda la muestra eran parte de la parte administrativa y 18% de toda la muestra a ventas. Se aplico Teorema de Chebyshev para determinar intervalos de confianza.</w:t>
+            </w:pPr>
+            <w:r>
+              <w:rPr>
+                <w:rFonts w:eastAsia="Arial" w:cs="Arial" w:ascii="Roboto" w:hAnsi="Roboto"/>
+                <w:color w:val="auto"/>
+                <w:highlight w:val="white"/>
+              </w:rPr>
+              <w:t>Para el análisis de estos datos se uso estadística descriptiva para las medidas de tendencia central (media, mediana y moda) y dispersión (desviación estándar, varianza e IQR), Teorema de Chebyshev para determinar intervalos de confianza al 75%. Se verificó normalidad con métodos visuales (Histogramas y diagrama de caja de bigotes), así como asimetría en los datos, comparación entre media/mediana y  moda. Se analizaron la variables cualitativas mediante frecuencias absolutas y relativas. Se usó Microsoft Excel como herramienta principal.</w:t>
             </w:r>
           </w:p>
           <w:p>
@@ -7063,30 +6450,12 @@
                 <w:color w:val="B7B7B7"/>
                 <w:highlight w:val="white"/>
               </w:rPr>
-            </w:r>
-          </w:p>
-          <w:p>
-            <w:pPr>
-              <w:pStyle w:val="Normal"/>
-              <w:rPr>
-                <w:rFonts w:ascii="Roboto" w:hAnsi="Roboto" w:eastAsia="Arial" w:cs="Arial"/>
-                <w:color w:val="B7B7B7"/>
-                <w:highlight w:val="white"/>
-              </w:rPr>
-            </w:pPr>
-            <w:r>
-              <w:rPr>
-                <w:rFonts w:eastAsia="Arial" w:cs="Arial" w:ascii="Roboto" w:hAnsi="Roboto"/>
-                <w:color w:val="B7B7B7"/>
-                <w:highlight w:val="white"/>
-              </w:rPr>
-              <w:t>Introducción</w:t>
-            </w:r>
-          </w:p>
-          <w:p>
-            <w:pPr>
-              <w:pStyle w:val="Normal"/>
-              <w:jc w:val="both"/>
+              <w:t>Medidas de resumen (tendencia central, dispersión y de forma)</w:t>
+            </w:r>
+          </w:p>
+          <w:p>
+            <w:pPr>
+              <w:pStyle w:val="Normal"/>
               <w:rPr>
                 <w:rFonts w:ascii="Roboto" w:hAnsi="Roboto" w:eastAsia="Arial" w:cs="Arial"/>
                 <w:color w:val="auto"/>
@@ -7099,111 +6468,7 @@
                 <w:color w:val="auto"/>
                 <w:highlight w:val="white"/>
               </w:rPr>
-              <w:t>El estudio del fenómeno del desempleo es un trabajo importante para los gobiernos e industria porque se ha convertido en un indicador de crecimiento económico importante. En pocas palabras, a mayor desempleo, menor crecimiento económico. Esta es una medida casi universal en cualquier sociedad moderna. Las consecuencias del desempleo son bastantes claras para todos, por eso el estudio de las causas toma un papel relevante, por que permite generar políticas publicas y privadas para mitigar este indice. Este análisis considera variables que definen el número de semanas de desempleo en trabajadores de la industria manufacturera, utilizando estadística descriptiva para identificar, patrones, valores atípicos y distribuciones.</w:t>
-            </w:r>
-          </w:p>
-          <w:p>
-            <w:pPr>
-              <w:pStyle w:val="Normal"/>
-              <w:rPr>
-                <w:rFonts w:ascii="Roboto" w:hAnsi="Roboto" w:eastAsia="Arial" w:cs="Arial"/>
-                <w:color w:val="B7B7B7"/>
-                <w:highlight w:val="white"/>
-              </w:rPr>
-            </w:pPr>
-            <w:r>
-              <w:rPr>
-                <w:rFonts w:eastAsia="Arial" w:cs="Arial" w:ascii="Roboto" w:hAnsi="Roboto"/>
-                <w:color w:val="B7B7B7"/>
-                <w:highlight w:val="white"/>
-              </w:rPr>
-              <w:t>Método</w:t>
-            </w:r>
-          </w:p>
-          <w:p>
-            <w:pPr>
-              <w:pStyle w:val="Normal"/>
-              <w:rPr>
-                <w:rFonts w:ascii="Roboto" w:hAnsi="Roboto" w:eastAsia="Arial" w:cs="Arial"/>
-                <w:color w:val="auto"/>
-                <w:highlight w:val="white"/>
-              </w:rPr>
-            </w:pPr>
-            <w:r>
-              <w:rPr>
-                <w:rFonts w:eastAsia="Arial" w:cs="Arial" w:ascii="Roboto" w:hAnsi="Roboto"/>
-                <w:color w:val="auto"/>
-                <w:highlight w:val="white"/>
-              </w:rPr>
-              <w:t xml:space="preserve">Para el análisis de estos datos se uso estadística descriptiva para las medidas de tendencia central (media, mediana y moda) y dispersión (desviación estándar, varianza </w:t>
-            </w:r>
-            <w:r>
-              <w:rPr>
-                <w:rFonts w:eastAsia="Arial" w:cs="Arial" w:ascii="Roboto" w:hAnsi="Roboto"/>
-                <w:color w:val="auto"/>
-                <w:highlight w:val="white"/>
-              </w:rPr>
-              <w:t>e</w:t>
-            </w:r>
-            <w:r>
-              <w:rPr>
-                <w:rFonts w:eastAsia="Arial" w:cs="Arial" w:ascii="Roboto" w:hAnsi="Roboto"/>
-                <w:color w:val="auto"/>
-                <w:highlight w:val="white"/>
-              </w:rPr>
-              <w:t xml:space="preserve"> IQR), Teorema de Chebyshev para determinar intervalos de confianza al 75%. Se verificó normalidad </w:t>
-            </w:r>
-            <w:r>
-              <w:rPr>
-                <w:rFonts w:eastAsia="Arial" w:cs="Arial" w:ascii="Roboto" w:hAnsi="Roboto"/>
-                <w:color w:val="auto"/>
-                <w:highlight w:val="white"/>
-              </w:rPr>
-              <w:t>con métodos visuales (Histogramas y diagrama de caja de bigotes), así como asimetría en los datos, comparación entre media/mediana y  moda. Se analizaron la variables cualitativas mediante frecuencias absolutas y relativas. Se usó Microsoft Excel como herramienta principal.</w:t>
-            </w:r>
-          </w:p>
-          <w:p>
-            <w:pPr>
-              <w:pStyle w:val="Normal"/>
-              <w:rPr>
-                <w:rFonts w:ascii="Roboto" w:hAnsi="Roboto" w:eastAsia="Arial" w:cs="Arial"/>
-                <w:color w:val="B7B7B7"/>
-                <w:highlight w:val="white"/>
-              </w:rPr>
-            </w:pPr>
-            <w:r>
-              <w:rPr>
-                <w:rFonts w:eastAsia="Arial" w:cs="Arial" w:ascii="Roboto" w:hAnsi="Roboto"/>
-                <w:color w:val="B7B7B7"/>
-                <w:highlight w:val="white"/>
-              </w:rPr>
-              <w:t>Medidas de resumen (tendencia central, dispersión y de forma)</w:t>
-            </w:r>
-          </w:p>
-          <w:p>
-            <w:pPr>
-              <w:pStyle w:val="Normal"/>
-              <w:rPr>
-                <w:rFonts w:ascii="Roboto" w:hAnsi="Roboto" w:eastAsia="Arial" w:cs="Arial"/>
-                <w:color w:val="auto"/>
-                <w:highlight w:val="white"/>
-              </w:rPr>
-            </w:pPr>
-            <w:r>
-              <w:rPr>
-                <w:rFonts w:eastAsia="Arial" w:cs="Arial" w:ascii="Roboto" w:hAnsi="Roboto"/>
-                <w:color w:val="auto"/>
-                <w:highlight w:val="white"/>
-              </w:rPr>
-              <w:t xml:space="preserve">La tabla muestra </w:t>
-            </w:r>
-            <w:r>
-              <w:rPr>
-                <w:rFonts w:eastAsia="Arial" w:cs="Arial" w:ascii="Roboto" w:hAnsi="Roboto"/>
-                <w:color w:val="auto"/>
-                <w:highlight w:val="white"/>
-              </w:rPr>
-              <w:t>el resumen de las medidas de las variables cuantitativas. Se observa que la media es mayor que la mediana y la moda por lo que indica sesgo positivo. La asimetría mas alta corresponde años en el trabajo anterior (1.47), lo que confirma un sesgo positivo fuerte.</w:t>
+              <w:t>La tabla muestra el resumen de las medidas de las variables cuantitativas. Se observa que la media es mayor que la mediana y la moda por lo que indica sesgo positivo. La asimetría mas alta corresponde años en el trabajo anterior (1.47), lo que confirma un sesgo positivo fuerte.</w:t>
             </w:r>
           </w:p>
           <w:tbl>
@@ -7237,7 +6502,7 @@
                 </w:tcPr>
                 <w:p>
                   <w:pPr>
-                    <w:pStyle w:val="Contenidodelatabla"/>
+                    <w:pStyle w:val="Contenidodelatablauser"/>
                     <w:jc w:val="center"/>
                     <w:rPr>
                       <w:rFonts w:ascii="Roboto" w:hAnsi="Roboto" w:eastAsia="Arial" w:cs="Arial"/>
@@ -7258,7 +6523,7 @@
                 </w:tcPr>
                 <w:p>
                   <w:pPr>
-                    <w:pStyle w:val="Contenidodelatabla"/>
+                    <w:pStyle w:val="Contenidodelatablauser"/>
                     <w:jc w:val="center"/>
                     <w:rPr>
                       <w:rFonts w:ascii="Roboto" w:hAnsi="Roboto" w:eastAsia="Arial" w:cs="Arial"/>
@@ -7279,7 +6544,7 @@
                 </w:tcPr>
                 <w:p>
                   <w:pPr>
-                    <w:pStyle w:val="Contenidodelatabla"/>
+                    <w:pStyle w:val="Contenidodelatablauser"/>
                     <w:jc w:val="center"/>
                     <w:rPr>
                       <w:rFonts w:ascii="Roboto" w:hAnsi="Roboto" w:eastAsia="Arial" w:cs="Arial"/>
@@ -7300,7 +6565,7 @@
                 </w:tcPr>
                 <w:p>
                   <w:pPr>
-                    <w:pStyle w:val="Contenidodelatabla"/>
+                    <w:pStyle w:val="Contenidodelatablauser"/>
                     <w:jc w:val="center"/>
                     <w:rPr>
                       <w:rFonts w:ascii="Roboto" w:hAnsi="Roboto" w:eastAsia="Arial" w:cs="Arial"/>
@@ -7321,7 +6586,7 @@
                 </w:tcPr>
                 <w:p>
                   <w:pPr>
-                    <w:pStyle w:val="Contenidodelatabla"/>
+                    <w:pStyle w:val="Contenidodelatablauser"/>
                     <w:jc w:val="center"/>
                     <w:rPr>
                       <w:rFonts w:ascii="Roboto" w:hAnsi="Roboto" w:eastAsia="Arial" w:cs="Arial"/>
@@ -7342,7 +6607,7 @@
                 </w:tcPr>
                 <w:p>
                   <w:pPr>
-                    <w:pStyle w:val="Contenidodelatabla"/>
+                    <w:pStyle w:val="Contenidodelatablauser"/>
                     <w:jc w:val="center"/>
                     <w:rPr>
                       <w:rFonts w:ascii="Roboto" w:hAnsi="Roboto" w:eastAsia="Arial" w:cs="Arial"/>
@@ -7363,7 +6628,7 @@
                 </w:tcPr>
                 <w:p>
                   <w:pPr>
-                    <w:pStyle w:val="Contenidodelatabla"/>
+                    <w:pStyle w:val="Contenidodelatablauser"/>
                     <w:jc w:val="center"/>
                     <w:rPr>
                       <w:rFonts w:ascii="Roboto" w:hAnsi="Roboto" w:eastAsia="Arial" w:cs="Arial"/>
@@ -7387,7 +6652,7 @@
                 </w:tcPr>
                 <w:p>
                   <w:pPr>
-                    <w:pStyle w:val="Contenidodelatabla"/>
+                    <w:pStyle w:val="Contenidodelatablauser"/>
                     <w:rPr>
                       <w:rFonts w:ascii="Roboto" w:hAnsi="Roboto" w:eastAsia="Arial" w:cs="Arial"/>
                     </w:rPr>
@@ -7407,7 +6672,7 @@
                 </w:tcPr>
                 <w:p>
                   <w:pPr>
-                    <w:pStyle w:val="Contenidodelatabla"/>
+                    <w:pStyle w:val="Contenidodelatablauser"/>
                     <w:jc w:val="center"/>
                     <w:rPr>
                       <w:rFonts w:ascii="Roboto" w:hAnsi="Roboto" w:eastAsia="Arial" w:cs="Arial"/>
@@ -7428,7 +6693,7 @@
                 </w:tcPr>
                 <w:p>
                   <w:pPr>
-                    <w:pStyle w:val="Contenidodelatabla"/>
+                    <w:pStyle w:val="Contenidodelatablauser"/>
                     <w:jc w:val="center"/>
                     <w:rPr>
                       <w:rFonts w:ascii="Roboto" w:hAnsi="Roboto" w:eastAsia="Arial" w:cs="Arial"/>
@@ -7449,7 +6714,7 @@
                 </w:tcPr>
                 <w:p>
                   <w:pPr>
-                    <w:pStyle w:val="Contenidodelatabla"/>
+                    <w:pStyle w:val="Contenidodelatablauser"/>
                     <w:jc w:val="center"/>
                     <w:rPr>
                       <w:rFonts w:ascii="Roboto" w:hAnsi="Roboto" w:eastAsia="Arial" w:cs="Arial"/>
@@ -7470,7 +6735,7 @@
                 </w:tcPr>
                 <w:p>
                   <w:pPr>
-                    <w:pStyle w:val="Contenidodelatabla"/>
+                    <w:pStyle w:val="Contenidodelatablauser"/>
                     <w:jc w:val="center"/>
                     <w:rPr>
                       <w:rFonts w:ascii="Roboto" w:hAnsi="Roboto" w:eastAsia="Arial" w:cs="Arial"/>
@@ -7491,7 +6756,7 @@
                 </w:tcPr>
                 <w:p>
                   <w:pPr>
-                    <w:pStyle w:val="Contenidodelatabla"/>
+                    <w:pStyle w:val="Contenidodelatablauser"/>
                     <w:jc w:val="center"/>
                     <w:rPr>
                       <w:rFonts w:ascii="Roboto" w:hAnsi="Roboto" w:eastAsia="Arial" w:cs="Arial"/>
@@ -7512,7 +6777,7 @@
                 </w:tcPr>
                 <w:p>
                   <w:pPr>
-                    <w:pStyle w:val="Contenidodelatabla"/>
+                    <w:pStyle w:val="Contenidodelatablauser"/>
                     <w:jc w:val="center"/>
                     <w:rPr>
                       <w:rFonts w:ascii="Roboto" w:hAnsi="Roboto" w:eastAsia="Arial" w:cs="Arial"/>
@@ -7536,7 +6801,7 @@
                 </w:tcPr>
                 <w:p>
                   <w:pPr>
-                    <w:pStyle w:val="Contenidodelatabla"/>
+                    <w:pStyle w:val="Contenidodelatablauser"/>
                     <w:rPr>
                       <w:rFonts w:ascii="Roboto" w:hAnsi="Roboto" w:eastAsia="Arial" w:cs="Arial"/>
                     </w:rPr>
@@ -7556,7 +6821,7 @@
                 </w:tcPr>
                 <w:p>
                   <w:pPr>
-                    <w:pStyle w:val="Contenidodelatabla"/>
+                    <w:pStyle w:val="Contenidodelatablauser"/>
                     <w:jc w:val="center"/>
                     <w:rPr>
                       <w:rFonts w:ascii="Roboto" w:hAnsi="Roboto" w:eastAsia="Arial" w:cs="Arial"/>
@@ -7577,7 +6842,7 @@
                 </w:tcPr>
                 <w:p>
                   <w:pPr>
-                    <w:pStyle w:val="Contenidodelatabla"/>
+                    <w:pStyle w:val="Contenidodelatablauser"/>
                     <w:jc w:val="center"/>
                     <w:rPr>
                       <w:rFonts w:ascii="Roboto" w:hAnsi="Roboto" w:eastAsia="Arial" w:cs="Arial"/>
@@ -7598,7 +6863,7 @@
                 </w:tcPr>
                 <w:p>
                   <w:pPr>
-                    <w:pStyle w:val="Contenidodelatabla"/>
+                    <w:pStyle w:val="Contenidodelatablauser"/>
                     <w:jc w:val="center"/>
                     <w:rPr>
                       <w:rFonts w:ascii="Roboto" w:hAnsi="Roboto" w:eastAsia="Arial" w:cs="Arial"/>
@@ -7619,7 +6884,7 @@
                 </w:tcPr>
                 <w:p>
                   <w:pPr>
-                    <w:pStyle w:val="Contenidodelatabla"/>
+                    <w:pStyle w:val="Contenidodelatablauser"/>
                     <w:jc w:val="center"/>
                     <w:rPr>
                       <w:rFonts w:ascii="Roboto" w:hAnsi="Roboto" w:eastAsia="Arial" w:cs="Arial"/>
@@ -7640,7 +6905,7 @@
                 </w:tcPr>
                 <w:p>
                   <w:pPr>
-                    <w:pStyle w:val="Contenidodelatabla"/>
+                    <w:pStyle w:val="Contenidodelatablauser"/>
                     <w:jc w:val="center"/>
                     <w:rPr>
                       <w:rFonts w:ascii="Roboto" w:hAnsi="Roboto" w:eastAsia="Arial" w:cs="Arial"/>
@@ -7661,7 +6926,7 @@
                 </w:tcPr>
                 <w:p>
                   <w:pPr>
-                    <w:pStyle w:val="Contenidodelatabla"/>
+                    <w:pStyle w:val="Contenidodelatablauser"/>
                     <w:jc w:val="center"/>
                     <w:rPr>
                       <w:rFonts w:ascii="Roboto" w:hAnsi="Roboto" w:eastAsia="Arial" w:cs="Arial"/>
@@ -7685,7 +6950,7 @@
                 </w:tcPr>
                 <w:p>
                   <w:pPr>
-                    <w:pStyle w:val="Contenidodelatabla"/>
+                    <w:pStyle w:val="Contenidodelatablauser"/>
                     <w:rPr>
                       <w:rFonts w:ascii="Roboto" w:hAnsi="Roboto" w:eastAsia="Arial" w:cs="Arial"/>
                     </w:rPr>
@@ -7694,13 +6959,7 @@
                     <w:rPr>
                       <w:rFonts w:eastAsia="Arial" w:cs="Arial" w:ascii="Roboto" w:hAnsi="Roboto"/>
                     </w:rPr>
-                    <w:t>Años Tra</w:t>
-                  </w:r>
-                  <w:r>
-                    <w:rPr>
-                      <w:rFonts w:eastAsia="Arial" w:cs="Arial" w:ascii="Roboto" w:hAnsi="Roboto"/>
-                    </w:rPr>
-                    <w:t>b</w:t>
+                    <w:t>Años Trab</w:t>
                   </w:r>
                 </w:p>
               </w:tc>
@@ -7711,7 +6970,7 @@
                 </w:tcPr>
                 <w:p>
                   <w:pPr>
-                    <w:pStyle w:val="Contenidodelatabla"/>
+                    <w:pStyle w:val="Contenidodelatablauser"/>
                     <w:jc w:val="center"/>
                     <w:rPr>
                       <w:rFonts w:ascii="Roboto" w:hAnsi="Roboto" w:eastAsia="Arial" w:cs="Arial"/>
@@ -7732,7 +6991,7 @@
                 </w:tcPr>
                 <w:p>
                   <w:pPr>
-                    <w:pStyle w:val="Contenidodelatabla"/>
+                    <w:pStyle w:val="Contenidodelatablauser"/>
                     <w:jc w:val="center"/>
                     <w:rPr>
                       <w:rFonts w:ascii="Roboto" w:hAnsi="Roboto" w:eastAsia="Arial" w:cs="Arial"/>
@@ -7753,7 +7012,7 @@
                 </w:tcPr>
                 <w:p>
                   <w:pPr>
-                    <w:pStyle w:val="Contenidodelatabla"/>
+                    <w:pStyle w:val="Contenidodelatablauser"/>
                     <w:jc w:val="center"/>
                     <w:rPr>
                       <w:rFonts w:ascii="Roboto" w:hAnsi="Roboto" w:eastAsia="Arial" w:cs="Arial"/>
@@ -7774,7 +7033,7 @@
                 </w:tcPr>
                 <w:p>
                   <w:pPr>
-                    <w:pStyle w:val="Contenidodelatabla"/>
+                    <w:pStyle w:val="Contenidodelatablauser"/>
                     <w:jc w:val="center"/>
                     <w:rPr>
                       <w:rFonts w:ascii="Roboto" w:hAnsi="Roboto" w:eastAsia="Arial" w:cs="Arial"/>
@@ -7795,7 +7054,7 @@
                 </w:tcPr>
                 <w:p>
                   <w:pPr>
-                    <w:pStyle w:val="Contenidodelatabla"/>
+                    <w:pStyle w:val="Contenidodelatablauser"/>
                     <w:jc w:val="center"/>
                     <w:rPr>
                       <w:rFonts w:ascii="Roboto" w:hAnsi="Roboto" w:eastAsia="Arial" w:cs="Arial"/>
@@ -7816,7 +7075,7 @@
                 </w:tcPr>
                 <w:p>
                   <w:pPr>
-                    <w:pStyle w:val="Contenidodelatabla"/>
+                    <w:pStyle w:val="Contenidodelatablauser"/>
                     <w:jc w:val="center"/>
                     <w:rPr>
                       <w:rFonts w:ascii="Roboto" w:hAnsi="Roboto" w:eastAsia="Arial" w:cs="Arial"/>
@@ -8213,47 +7472,7 @@
                 <w:color w:val="auto"/>
                 <w:highlight w:val="white"/>
               </w:rPr>
-              <w:t xml:space="preserve">La media de semanas de desempleo es de 43.36 semanas, mediana de 39.5 y una moda de 37. La diferencia entre media y mediana  indica un ligero sesgo positivo (asimetría=0.34). La desviación estándar  es de 23.68 semanas, lo que refleja una alta variabilidad en el tiempo de desempleo, pero al tener una media de 43.36 indica que una persona desempleada del sector manufacturero puede estar </w:t>
-            </w:r>
-            <w:r>
-              <w:rPr>
-                <w:rFonts w:eastAsia="Arial" w:cs="Arial" w:ascii="Roboto" w:hAnsi="Roboto"/>
-                <w:color w:val="auto"/>
-                <w:highlight w:val="white"/>
-              </w:rPr>
-              <w:t xml:space="preserve">aproximadamente </w:t>
-            </w:r>
-            <w:r>
-              <w:rPr>
-                <w:rFonts w:eastAsia="Arial" w:cs="Arial" w:ascii="Roboto" w:hAnsi="Roboto"/>
-                <w:color w:val="auto"/>
-                <w:highlight w:val="white"/>
-              </w:rPr>
-              <w:t xml:space="preserve">9 meses </w:t>
-            </w:r>
-            <w:r>
-              <w:rPr>
-                <w:rFonts w:eastAsia="Arial" w:cs="Arial" w:ascii="Roboto" w:hAnsi="Roboto"/>
-                <w:color w:val="auto"/>
-                <w:highlight w:val="white"/>
-              </w:rPr>
-              <w:t>sin trabajo</w:t>
-            </w:r>
-            <w:r>
-              <w:rPr>
-                <w:rFonts w:eastAsia="Arial" w:cs="Arial" w:ascii="Roboto" w:hAnsi="Roboto"/>
-                <w:color w:val="auto"/>
-                <w:highlight w:val="white"/>
-              </w:rPr>
-              <w:t xml:space="preserve">. </w:t>
-            </w:r>
-            <w:r>
-              <w:rPr>
-                <w:rFonts w:eastAsia="Arial" w:cs="Arial" w:ascii="Roboto" w:hAnsi="Roboto"/>
-                <w:color w:val="auto"/>
-                <w:highlight w:val="white"/>
-              </w:rPr>
-              <w:t xml:space="preserve">No se observaron datos atípicos según la regla de 1,5XIQR. La distribución no sigue una distribución normal. </w:t>
+              <w:t xml:space="preserve">La media de semanas de desempleo es de 43.36 semanas, mediana de 39.5 y una moda de 37. La diferencia entre media y mediana  indica un ligero sesgo positivo (asimetría=0.34). La desviación estándar  es de 23.68 semanas, lo que refleja una alta variabilidad en el tiempo de desempleo, pero al tener una media de 43.36 indica que una persona desempleada del sector manufacturero puede estar aproximadamente 9 meses sin trabajo. No se observaron datos atípicos según la regla de 1,5XIQR. La distribución no sigue una distribución normal. </w:t>
             </w:r>
           </w:p>
           <w:p>
@@ -8295,15 +7514,7 @@
                 <w:color w:val="auto"/>
                 <w:highlight w:val="white"/>
               </w:rPr>
-              <w:t xml:space="preserve">2. </w:t>
-            </w:r>
-            <w:r>
-              <w:rPr>
-                <w:rFonts w:eastAsia="Arial" w:cs="Arial" w:ascii="Roboto" w:hAnsi="Roboto"/>
-                <w:color w:val="auto"/>
-                <w:highlight w:val="white"/>
-              </w:rPr>
-              <w:t>Edad</w:t>
+              <w:t>2. Edad</w:t>
             </w:r>
           </w:p>
           <w:p>
@@ -8311,7 +7522,7 @@
               <w:pStyle w:val="Normal"/>
               <w:numPr>
                 <w:ilvl w:val="2"/>
-                <w:numId w:val="7"/>
+                <w:numId w:val="6"/>
               </w:numPr>
               <w:rPr>
                 <w:rFonts w:ascii="Roboto" w:hAnsi="Roboto" w:eastAsia="Arial" w:cs="Arial"/>
@@ -8371,23 +7582,7 @@
                 <w:color w:val="auto"/>
                 <w:highlight w:val="white"/>
               </w:rPr>
-              <w:t xml:space="preserve">Al aplicar el teorema de  </w:t>
-            </w:r>
-            <w:r>
-              <w:rPr>
-                <w:rFonts w:eastAsia="Arial" w:cs="Arial" w:ascii="Roboto" w:hAnsi="Roboto"/>
-                <w:color w:val="auto"/>
-                <w:highlight w:val="white"/>
-              </w:rPr>
-              <w:t xml:space="preserve">Chebyshev, </w:t>
-            </w:r>
-            <w:r>
-              <w:rPr>
-                <w:rFonts w:eastAsia="Arial" w:cs="Arial" w:ascii="Roboto" w:hAnsi="Roboto"/>
-                <w:color w:val="auto"/>
-                <w:highlight w:val="white"/>
-              </w:rPr>
-              <w:t xml:space="preserve">al menos 75% de los datos caen tre 16.48 y 52.72, en la muestra el 96%. </w:t>
+              <w:t xml:space="preserve">Al aplicar el teorema de  Chebyshev, al menos 75% de los datos caen tre 16.48 y 52.72, en la muestra el 96%. </w:t>
             </w:r>
           </w:p>
           <w:p>
@@ -8418,7 +7613,7 @@
               <w:pStyle w:val="Normal"/>
               <w:numPr>
                 <w:ilvl w:val="2"/>
-                <w:numId w:val="9"/>
+                <w:numId w:val="7"/>
               </w:numPr>
               <w:rPr>
                 <w:rFonts w:ascii="Roboto" w:hAnsi="Roboto" w:eastAsia="Arial" w:cs="Arial"/>
@@ -8455,25 +7650,117 @@
                 <w:color w:val="auto"/>
                 <w:highlight w:val="white"/>
               </w:rPr>
-              <w:t xml:space="preserve">Se </w:t>
-            </w:r>
-            <w:r>
-              <w:rPr>
-                <w:rFonts w:eastAsia="Arial" w:cs="Arial" w:ascii="Roboto" w:hAnsi="Roboto"/>
+              <w:t xml:space="preserve">Se observaron dos datos atípicos 22 y 30 años y no hay evidencia que los datos sigan una distribución normal. </w:t>
+              <w:br/>
+              <w:t>Al aplicar el teorema de  Chebyshev, al menos el 75% de los datos caen entre 0 y 20.04 años, en la muestra son el 94%. Esto sugiere que estas personas  contaban con experiencia significativa en su último empleo (habría que realizar mas estudios para corroborar esta idea). Sin embargo se entiende que en la industria manufacturera, la rotación de empleados es alta.</w:t>
+            </w:r>
+          </w:p>
+          <w:p>
+            <w:pPr>
+              <w:pStyle w:val="Normal"/>
+              <w:numPr>
+                <w:ilvl w:val="0"/>
+                <w:numId w:val="0"/>
+              </w:numPr>
+              <w:ind w:hanging="0" w:start="1440"/>
+              <w:rPr>
+                <w:rFonts w:ascii="Roboto" w:hAnsi="Roboto" w:eastAsia="Arial" w:cs="Arial"/>
                 <w:color w:val="auto"/>
                 <w:highlight w:val="white"/>
               </w:rPr>
-              <w:t>observaron</w:t>
-            </w:r>
+            </w:pPr>
             <w:r>
               <w:rPr>
                 <w:rFonts w:eastAsia="Arial" w:cs="Arial" w:ascii="Roboto" w:hAnsi="Roboto"/>
                 <w:color w:val="auto"/>
                 <w:highlight w:val="white"/>
               </w:rPr>
-              <w:t xml:space="preserve"> dos datos atípicos 22 y 30 años y no hay evidencia que los datos sigan una distribución normal. </w:t>
+            </w:r>
+          </w:p>
+          <w:p>
+            <w:pPr>
+              <w:pStyle w:val="Normal"/>
+              <w:rPr>
+                <w:rFonts w:ascii="Roboto" w:hAnsi="Roboto" w:eastAsia="Arial" w:cs="Arial"/>
+                <w:color w:val="auto"/>
+                <w:highlight w:val="white"/>
+              </w:rPr>
+            </w:pPr>
+            <w:r>
+              <w:rPr>
+                <w:rFonts w:eastAsia="Arial" w:cs="Arial" w:ascii="Roboto" w:hAnsi="Roboto"/>
+                <w:color w:val="auto"/>
+                <w:highlight w:val="white"/>
+              </w:rPr>
+              <w:t xml:space="preserve">   </w:t>
+            </w:r>
+            <w:r>
+              <w:rPr>
+                <w:rFonts w:eastAsia="Arial" w:cs="Arial" w:ascii="Roboto" w:hAnsi="Roboto"/>
+                <w:color w:val="auto"/>
+                <w:highlight w:val="white"/>
+              </w:rPr>
+              <w:t xml:space="preserve">2. Análisis de variables cualitativas </w:t>
+            </w:r>
+          </w:p>
+          <w:p>
+            <w:pPr>
+              <w:pStyle w:val="Normal"/>
+              <w:rPr>
+                <w:rFonts w:ascii="Roboto" w:hAnsi="Roboto" w:eastAsia="Arial" w:cs="Arial"/>
+                <w:color w:val="auto"/>
+                <w:highlight w:val="white"/>
+              </w:rPr>
+            </w:pPr>
+            <w:r>
+              <w:rPr>
+                <w:rFonts w:eastAsia="Arial" w:cs="Arial" w:ascii="Roboto" w:hAnsi="Roboto"/>
+                <w:color w:val="auto"/>
+                <w:highlight w:val="white"/>
+              </w:rPr>
+            </w:r>
+          </w:p>
+          <w:p>
+            <w:pPr>
+              <w:pStyle w:val="Normal"/>
+              <w:numPr>
+                <w:ilvl w:val="0"/>
+                <w:numId w:val="0"/>
+              </w:numPr>
+              <w:ind w:hanging="0" w:start="720"/>
+              <w:jc w:val="both"/>
+              <w:rPr>
+                <w:rFonts w:ascii="Roboto" w:hAnsi="Roboto" w:eastAsia="Arial" w:cs="Arial"/>
+                <w:color w:val="auto"/>
+                <w:highlight w:val="white"/>
+              </w:rPr>
+            </w:pPr>
+            <w:r>
+              <w:rPr>
+                <w:rFonts w:eastAsia="Arial" w:cs="Arial" w:ascii="Roboto" w:hAnsi="Roboto"/>
+                <w:color w:val="auto"/>
+                <w:highlight w:val="white"/>
+              </w:rPr>
+              <w:t>El 70% (35 empleados) de los empleados está</w:t>
+            </w:r>
+            <w:r>
+              <w:rPr>
+                <w:rFonts w:eastAsia="Arial" w:cs="Arial" w:ascii="Roboto" w:hAnsi="Roboto"/>
+                <w:color w:val="auto"/>
+                <w:highlight w:val="white"/>
+              </w:rPr>
+              <w:t>n</w:t>
+            </w:r>
+            <w:r>
+              <w:rPr>
+                <w:rFonts w:eastAsia="Arial" w:cs="Arial" w:ascii="Roboto" w:hAnsi="Roboto"/>
+                <w:color w:val="auto"/>
+                <w:highlight w:val="white"/>
+              </w:rPr>
+              <w:t xml:space="preserve"> casados mientras que el 30% no lo está, esto es consistente con media de edad que es de 34.6 (habría que hacer otro análisis para corroborar la idea) el 30% no lo está (15 empleados).</w:t>
               <w:br/>
-              <w:t xml:space="preserve">Al aplicar el teorema de  </w:t>
+              <w:br/>
+              <w:t xml:space="preserve">El 68% son cabeza de familia (34) empleados, </w:t>
             </w:r>
             <w:r>
               <w:rPr>
@@ -8481,7 +7768,7 @@
                 <w:color w:val="auto"/>
                 <w:highlight w:val="white"/>
               </w:rPr>
-              <w:t>Chebyshe</w:t>
+              <w:t>una proporción similar a los casados (70%), lo que sugiere</w:t>
             </w:r>
             <w:r>
               <w:rPr>
@@ -8489,7 +7776,7 @@
                 <w:color w:val="auto"/>
                 <w:highlight w:val="white"/>
               </w:rPr>
-              <w:t>v</w:t>
+              <w:t xml:space="preserve"> que son los mismos 35 casados de la variable anterior </w:t>
             </w:r>
             <w:r>
               <w:rPr>
@@ -8497,7 +7784,7 @@
                 <w:color w:val="auto"/>
                 <w:highlight w:val="white"/>
               </w:rPr>
-              <w:t xml:space="preserve">, </w:t>
+              <w:t>pero no necesariamente</w:t>
             </w:r>
             <w:r>
               <w:rPr>
@@ -8505,7 +7792,131 @@
                 <w:color w:val="auto"/>
                 <w:highlight w:val="white"/>
               </w:rPr>
-              <w:t>al menos el 75% de los datos caen entre 0 y 20.04 años, en la muestra son el 94%. Esto sugiere que estas personas  contaban con experiencia significativa en su último empleo (habría que realizar mas estudios para corroborar esta idea). Sin embargo se entiende que en la industria manufacturera, la rotación de empleados es alta.</w:t>
+              <w:t xml:space="preserve">. </w:t>
+            </w:r>
+            <w:r>
+              <w:rPr>
+                <w:rFonts w:eastAsia="Arial" w:cs="Arial" w:ascii="Roboto" w:hAnsi="Roboto"/>
+                <w:color w:val="auto"/>
+                <w:highlight w:val="white"/>
+              </w:rPr>
+              <w:t>E</w:t>
+            </w:r>
+            <w:r>
+              <w:rPr>
+                <w:rFonts w:eastAsia="Arial" w:cs="Arial" w:ascii="Roboto" w:hAnsi="Roboto"/>
+                <w:color w:val="auto"/>
+                <w:highlight w:val="white"/>
+              </w:rPr>
+              <w:t xml:space="preserve">l 32% no lo son. </w:t>
+            </w:r>
+          </w:p>
+          <w:p>
+            <w:pPr>
+              <w:pStyle w:val="Normal"/>
+              <w:numPr>
+                <w:ilvl w:val="0"/>
+                <w:numId w:val="0"/>
+              </w:numPr>
+              <w:ind w:hanging="0" w:start="720"/>
+              <w:jc w:val="both"/>
+              <w:rPr>
+                <w:rFonts w:ascii="Roboto" w:hAnsi="Roboto" w:eastAsia="Arial" w:cs="Arial"/>
+                <w:color w:val="auto"/>
+                <w:highlight w:val="white"/>
+              </w:rPr>
+            </w:pPr>
+            <w:r>
+              <w:rPr>
+                <w:rFonts w:eastAsia="Arial" w:cs="Arial" w:ascii="Roboto" w:hAnsi="Roboto"/>
+                <w:color w:val="auto"/>
+                <w:highlight w:val="white"/>
+              </w:rPr>
+              <w:br/>
+              <w:t xml:space="preserve">Solo el 10% (5 personas) trabajó como administrador, </w:t>
+            </w:r>
+            <w:r>
+              <w:rPr>
+                <w:rFonts w:eastAsia="Arial" w:cs="Arial" w:ascii="Roboto" w:hAnsi="Roboto"/>
+                <w:color w:val="auto"/>
+                <w:highlight w:val="white"/>
+              </w:rPr>
+              <w:t>lo que sugiere</w:t>
+            </w:r>
+            <w:r>
+              <w:rPr>
+                <w:rFonts w:eastAsia="Arial" w:cs="Arial" w:ascii="Roboto" w:hAnsi="Roboto"/>
+                <w:color w:val="auto"/>
+                <w:highlight w:val="white"/>
+              </w:rPr>
+              <w:t xml:space="preserve"> que la mayoría de los empleados eran obreros o técnicos.</w:t>
+            </w:r>
+          </w:p>
+          <w:p>
+            <w:pPr>
+              <w:pStyle w:val="Normal"/>
+              <w:numPr>
+                <w:ilvl w:val="0"/>
+                <w:numId w:val="0"/>
+              </w:numPr>
+              <w:ind w:hanging="0" w:start="720"/>
+              <w:jc w:val="both"/>
+              <w:rPr>
+                <w:rFonts w:ascii="Roboto" w:hAnsi="Roboto" w:eastAsia="Arial" w:cs="Arial"/>
+                <w:color w:val="auto"/>
+                <w:highlight w:val="white"/>
+              </w:rPr>
+            </w:pPr>
+            <w:r>
+              <w:rPr>
+                <w:rFonts w:eastAsia="Arial" w:cs="Arial" w:ascii="Roboto" w:hAnsi="Roboto"/>
+                <w:color w:val="auto"/>
+                <w:highlight w:val="white"/>
+              </w:rPr>
+              <w:br/>
+              <w:t>Solo el 18% (9 personas) trabajó en ventas, lo cual también es indicador que los despidos en la industria manufacturera es nivel obrero y técnico, esto se une  con la idea de la continua rotación de personal en ese ramo.</w:t>
+              <w:br/>
+              <w:br/>
+              <w:t xml:space="preserve">En cuento a educación el nivel más frecuente es de 15 años de estudio (9 personas el 18%), seguido de 13 años (8 personas  , </w:t>
+            </w:r>
+            <w:r>
+              <w:rPr>
+                <w:rFonts w:eastAsia="Arial" w:cs="Arial" w:ascii="Roboto" w:hAnsi="Roboto"/>
+                <w:color w:val="auto"/>
+                <w:highlight w:val="white"/>
+              </w:rPr>
+              <w:t>16%</w:t>
+            </w:r>
+            <w:r>
+              <w:rPr>
+                <w:rFonts w:eastAsia="Arial" w:cs="Arial" w:ascii="Roboto" w:hAnsi="Roboto"/>
+                <w:color w:val="auto"/>
+                <w:highlight w:val="white"/>
+              </w:rPr>
+              <w:t>). Podríamos sugerir que los mayores niveles de estudio corresponde a las personas en la parte administrativa y de ventas  si vemos.</w:t>
+            </w:r>
+          </w:p>
+          <w:p>
+            <w:pPr>
+              <w:pStyle w:val="Normal"/>
+              <w:numPr>
+                <w:ilvl w:val="0"/>
+                <w:numId w:val="0"/>
+              </w:numPr>
+              <w:ind w:hanging="0" w:start="720"/>
+              <w:rPr>
+                <w:rFonts w:ascii="Roboto" w:hAnsi="Roboto" w:eastAsia="Arial" w:cs="Arial"/>
+                <w:color w:val="auto"/>
+                <w:highlight w:val="white"/>
+              </w:rPr>
+            </w:pPr>
+            <w:r>
+              <w:rPr>
+                <w:rFonts w:eastAsia="Arial" w:cs="Arial" w:ascii="Roboto" w:hAnsi="Roboto"/>
+                <w:color w:val="auto"/>
+                <w:highlight w:val="white"/>
+              </w:rPr>
+              <w:t xml:space="preserve"> </w:t>
             </w:r>
           </w:p>
           <w:p>
@@ -8529,18 +7940,195 @@
           <w:p>
             <w:pPr>
               <w:pStyle w:val="Normal"/>
-              <w:rPr>
-                <w:rFonts w:ascii="Roboto" w:hAnsi="Roboto" w:eastAsia="Arial" w:cs="Arial"/>
-                <w:color w:val="202124"/>
-                <w:highlight w:val="white"/>
-              </w:rPr>
-            </w:pPr>
-            <w:r>
-              <w:rPr>
-                <w:rFonts w:eastAsia="Arial" w:cs="Arial" w:ascii="Roboto" w:hAnsi="Roboto"/>
-                <w:color w:val="202124"/>
-                <w:highlight w:val="white"/>
-              </w:rPr>
+              <w:numPr>
+                <w:ilvl w:val="0"/>
+                <w:numId w:val="9"/>
+              </w:numPr>
+              <w:rPr>
+                <w:rFonts w:ascii="Roboto" w:hAnsi="Roboto" w:eastAsia="Arial" w:cs="Arial"/>
+                <w:color w:val="202124"/>
+                <w:highlight w:val="white"/>
+              </w:rPr>
+            </w:pPr>
+            <w:r>
+              <w:rPr>
+                <w:rFonts w:eastAsia="Arial" w:cs="Arial" w:ascii="Roboto" w:hAnsi="Roboto"/>
+                <w:color w:val="202124"/>
+                <w:highlight w:val="white"/>
+              </w:rPr>
+              <w:t>Las tres variables cuantitativas (Semanas de desempleo, Edad, Años en el trabajo anterior) presentas sesgo positivo y no siguen una distribución normal.</w:t>
+            </w:r>
+          </w:p>
+          <w:p>
+            <w:pPr>
+              <w:pStyle w:val="Normal"/>
+              <w:numPr>
+                <w:ilvl w:val="0"/>
+                <w:numId w:val="9"/>
+              </w:numPr>
+              <w:rPr>
+                <w:rFonts w:ascii="Roboto" w:hAnsi="Roboto" w:eastAsia="Arial" w:cs="Arial"/>
+                <w:color w:val="202124"/>
+                <w:highlight w:val="white"/>
+              </w:rPr>
+            </w:pPr>
+            <w:r>
+              <w:rPr>
+                <w:rFonts w:eastAsia="Arial" w:cs="Arial" w:ascii="Roboto" w:hAnsi="Roboto"/>
+                <w:color w:val="202124"/>
+                <w:highlight w:val="white"/>
+              </w:rPr>
+              <w:t>El promedio de sem</w:t>
+            </w:r>
+            <w:r>
+              <w:rPr>
+                <w:rFonts w:eastAsia="Arial" w:cs="Arial" w:ascii="Roboto" w:hAnsi="Roboto"/>
+                <w:color w:val="202124"/>
+                <w:highlight w:val="white"/>
+              </w:rPr>
+              <w:t>anas</w:t>
+            </w:r>
+            <w:r>
+              <w:rPr>
+                <w:rFonts w:eastAsia="Arial" w:cs="Arial" w:ascii="Roboto" w:hAnsi="Roboto"/>
+                <w:color w:val="202124"/>
+                <w:highlight w:val="white"/>
+              </w:rPr>
+              <w:t xml:space="preserve"> de desempleo es de 43.36 semanas (aproximadamente 9 meses) con alta variabilidad (desviación estándar = 23.68)</w:t>
+            </w:r>
+          </w:p>
+          <w:p>
+            <w:pPr>
+              <w:pStyle w:val="Normal"/>
+              <w:numPr>
+                <w:ilvl w:val="0"/>
+                <w:numId w:val="9"/>
+              </w:numPr>
+              <w:rPr>
+                <w:rFonts w:ascii="Roboto" w:hAnsi="Roboto" w:eastAsia="Arial" w:cs="Arial"/>
+                <w:color w:val="202124"/>
+                <w:highlight w:val="white"/>
+              </w:rPr>
+            </w:pPr>
+            <w:r>
+              <w:rPr>
+                <w:rFonts w:eastAsia="Arial" w:cs="Arial" w:ascii="Roboto" w:hAnsi="Roboto"/>
+                <w:color w:val="202124"/>
+                <w:highlight w:val="white"/>
+              </w:rPr>
+              <w:t xml:space="preserve">Se detectaron valores atípicos en Edad (62 años) y Años en el trabajo anterior (22,30). </w:t>
+            </w:r>
+            <w:r>
+              <w:rPr>
+                <w:rFonts w:eastAsia="Arial" w:cs="Arial" w:ascii="Roboto" w:hAnsi="Roboto"/>
+                <w:color w:val="202124"/>
+                <w:highlight w:val="white"/>
+              </w:rPr>
+              <w:t>Se entiende que estos valores atípicos se deben al tipo de ramo (manufacturero), done hay personas con muchos años de experiencia y otras con poca.</w:t>
+            </w:r>
+            <w:r>
+              <w:rPr>
+                <w:rFonts w:eastAsia="Arial" w:cs="Arial" w:ascii="Roboto" w:hAnsi="Roboto"/>
+                <w:color w:val="202124"/>
+                <w:highlight w:val="white"/>
+              </w:rPr>
+              <w:t xml:space="preserve"> </w:t>
+            </w:r>
+          </w:p>
+          <w:p>
+            <w:pPr>
+              <w:pStyle w:val="Normal"/>
+              <w:numPr>
+                <w:ilvl w:val="0"/>
+                <w:numId w:val="9"/>
+              </w:numPr>
+              <w:rPr>
+                <w:rFonts w:ascii="Roboto" w:hAnsi="Roboto" w:eastAsia="Arial" w:cs="Arial"/>
+                <w:color w:val="202124"/>
+                <w:highlight w:val="white"/>
+              </w:rPr>
+            </w:pPr>
+            <w:r>
+              <w:rPr>
+                <w:rFonts w:eastAsia="Arial" w:cs="Arial" w:ascii="Roboto" w:hAnsi="Roboto"/>
+                <w:color w:val="202124"/>
+                <w:highlight w:val="white"/>
+              </w:rPr>
+              <w:t>Al aplicar el teorema de Chevyshev al menos el 75% de los datos caen en los intervalos calculados; en la práctica el porcentaje real supera 94% en todas las variables</w:t>
+            </w:r>
+          </w:p>
+          <w:p>
+            <w:pPr>
+              <w:pStyle w:val="Normal"/>
+              <w:numPr>
+                <w:ilvl w:val="0"/>
+                <w:numId w:val="9"/>
+              </w:numPr>
+              <w:rPr>
+                <w:rFonts w:ascii="Roboto" w:hAnsi="Roboto" w:eastAsia="Arial" w:cs="Arial"/>
+                <w:color w:val="202124"/>
+                <w:highlight w:val="white"/>
+              </w:rPr>
+            </w:pPr>
+            <w:r>
+              <w:rPr>
+                <w:rFonts w:eastAsia="Arial" w:cs="Arial" w:ascii="Roboto" w:hAnsi="Roboto"/>
+                <w:color w:val="202124"/>
+                <w:highlight w:val="white"/>
+              </w:rPr>
+              <w:t>La mayoría de la muestras esta casada (70%) y es cabeza de familia (68%)</w:t>
+            </w:r>
+          </w:p>
+          <w:p>
+            <w:pPr>
+              <w:pStyle w:val="Normal"/>
+              <w:numPr>
+                <w:ilvl w:val="0"/>
+                <w:numId w:val="9"/>
+              </w:numPr>
+              <w:rPr>
+                <w:rFonts w:ascii="Roboto" w:hAnsi="Roboto" w:eastAsia="Arial" w:cs="Arial"/>
+                <w:color w:val="202124"/>
+                <w:highlight w:val="white"/>
+              </w:rPr>
+            </w:pPr>
+            <w:r>
+              <w:rPr>
+                <w:rFonts w:eastAsia="Arial" w:cs="Arial" w:ascii="Roboto" w:hAnsi="Roboto"/>
+                <w:color w:val="202124"/>
+                <w:highlight w:val="white"/>
+              </w:rPr>
+              <w:t xml:space="preserve">Solo el 10% trabajó en administración y el 18% en ventas, lo que sugiere que la mayoría de los despidos ocurrieron en puestos operativos. </w:t>
+            </w:r>
+          </w:p>
+          <w:p>
+            <w:pPr>
+              <w:pStyle w:val="Normal"/>
+              <w:numPr>
+                <w:ilvl w:val="0"/>
+                <w:numId w:val="9"/>
+              </w:numPr>
+              <w:rPr>
+                <w:rFonts w:ascii="Roboto" w:hAnsi="Roboto" w:eastAsia="Arial" w:cs="Arial"/>
+                <w:color w:val="202124"/>
+                <w:highlight w:val="white"/>
+              </w:rPr>
+            </w:pPr>
+            <w:r>
+              <w:rPr>
+                <w:rFonts w:eastAsia="Arial" w:cs="Arial" w:ascii="Roboto" w:hAnsi="Roboto"/>
+                <w:color w:val="202124"/>
+                <w:highlight w:val="white"/>
+              </w:rPr>
+              <w:t>Se recomienda ampliar el estudio con mas variables ,</w:t>
+            </w:r>
+            <w:r>
+              <w:rPr>
+                <w:rFonts w:eastAsia="Arial" w:cs="Arial" w:ascii="Roboto" w:hAnsi="Roboto"/>
+                <w:color w:val="202124"/>
+                <w:highlight w:val="white"/>
+              </w:rPr>
+              <w:t>estado y municipio del empleado y de las industrias, variables sobre salud y mas variables socioeconómicas para ver relaciones que no se han visto entre las variables actuales.</w:t>
             </w:r>
           </w:p>
         </w:tc>
@@ -8631,7 +8219,6 @@
   <w:p>
     <w:pPr>
       <w:pStyle w:val="Normal"/>
-      <w:pBdr/>
       <w:tabs>
         <w:tab w:val="clear" w:pos="720"/>
         <w:tab w:val="center" w:pos="4680" w:leader="none"/>
@@ -8663,7 +8250,6 @@
   <w:p>
     <w:pPr>
       <w:pStyle w:val="Normal"/>
-      <w:pBdr/>
       <w:tabs>
         <w:tab w:val="clear" w:pos="720"/>
         <w:tab w:val="center" w:pos="4680" w:leader="none"/>
@@ -8709,7 +8295,6 @@
   <w:p>
     <w:pPr>
       <w:pStyle w:val="Normal"/>
-      <w:pBdr/>
       <w:tabs>
         <w:tab w:val="clear" w:pos="720"/>
         <w:tab w:val="center" w:pos="4680" w:leader="none"/>
@@ -8733,7 +8318,7 @@
         <w:szCs w:val="20"/>
       </w:rPr>
       <w:drawing>
-        <wp:anchor distT="0" distB="0" distL="0" distR="0" simplePos="0" relativeHeight="11" behindDoc="1" locked="0" layoutInCell="1" allowOverlap="1">
+        <wp:anchor distT="0" distB="0" distL="0" distR="0" simplePos="0" relativeHeight="12" behindDoc="1" locked="0" layoutInCell="1" allowOverlap="1">
           <wp:simplePos x="0" y="0"/>
           <wp:positionH relativeFrom="column">
             <wp:posOffset>-628650</wp:posOffset>
@@ -8788,7 +8373,6 @@
   <w:p>
     <w:pPr>
       <w:pStyle w:val="Normal"/>
-      <w:pBdr/>
       <w:tabs>
         <w:tab w:val="clear" w:pos="720"/>
         <w:tab w:val="center" w:pos="4680" w:leader="none"/>
@@ -8812,7 +8396,7 @@
         <w:szCs w:val="20"/>
       </w:rPr>
       <w:drawing>
-        <wp:anchor distT="0" distB="0" distL="0" distR="0" simplePos="0" relativeHeight="11" behindDoc="1" locked="0" layoutInCell="1" allowOverlap="1">
+        <wp:anchor distT="0" distB="0" distL="0" distR="0" simplePos="0" relativeHeight="12" behindDoc="1" locked="0" layoutInCell="1" allowOverlap="1">
           <wp:simplePos x="0" y="0"/>
           <wp:positionH relativeFrom="column">
             <wp:posOffset>-628650</wp:posOffset>
@@ -9521,8 +9105,8 @@
   <w:abstractNum w:abstractNumId="6">
     <w:lvl w:ilvl="0">
       <w:start w:val="1"/>
-      <w:numFmt w:val="decimal"/>
-      <w:lvlText w:val="%1."/>
+      <w:numFmt w:val="bullet"/>
+      <w:lvlText w:val=""/>
       <w:lvlJc w:val="start"/>
       <w:pPr>
         <w:tabs>
@@ -9530,12 +9114,14 @@
         </w:tabs>
         <w:ind w:start="720" w:hanging="360"/>
       </w:pPr>
-      <w:rPr/>
+      <w:rPr>
+        <w:rFonts w:ascii="Symbol" w:hAnsi="Symbol" w:cs="Symbol" w:hint="default"/>
+      </w:rPr>
     </w:lvl>
     <w:lvl w:ilvl="1">
       <w:start w:val="1"/>
-      <w:numFmt w:val="decimal"/>
-      <w:lvlText w:val="%2."/>
+      <w:numFmt w:val="bullet"/>
+      <w:lvlText w:val="◦"/>
       <w:lvlJc w:val="start"/>
       <w:pPr>
         <w:tabs>
@@ -9543,12 +9129,14 @@
         </w:tabs>
         <w:ind w:start="1080" w:hanging="360"/>
       </w:pPr>
-      <w:rPr/>
+      <w:rPr>
+        <w:rFonts w:ascii="OpenSymbol" w:hAnsi="OpenSymbol" w:cs="OpenSymbol" w:hint="default"/>
+      </w:rPr>
     </w:lvl>
     <w:lvl w:ilvl="2">
       <w:start w:val="1"/>
-      <w:numFmt w:val="decimal"/>
-      <w:lvlText w:val="%3."/>
+      <w:numFmt w:val="bullet"/>
+      <w:lvlText w:val="▪"/>
       <w:lvlJc w:val="start"/>
       <w:pPr>
         <w:tabs>
@@ -9556,12 +9144,14 @@
         </w:tabs>
         <w:ind w:start="1440" w:hanging="360"/>
       </w:pPr>
-      <w:rPr/>
+      <w:rPr>
+        <w:rFonts w:ascii="OpenSymbol" w:hAnsi="OpenSymbol" w:cs="OpenSymbol" w:hint="default"/>
+      </w:rPr>
     </w:lvl>
     <w:lvl w:ilvl="3">
       <w:start w:val="1"/>
-      <w:numFmt w:val="decimal"/>
-      <w:lvlText w:val="%4."/>
+      <w:numFmt w:val="bullet"/>
+      <w:lvlText w:val=""/>
       <w:lvlJc w:val="start"/>
       <w:pPr>
         <w:tabs>
@@ -9569,12 +9159,14 @@
         </w:tabs>
         <w:ind w:start="1800" w:hanging="360"/>
       </w:pPr>
-      <w:rPr/>
+      <w:rPr>
+        <w:rFonts w:ascii="Symbol" w:hAnsi="Symbol" w:cs="Symbol" w:hint="default"/>
+      </w:rPr>
     </w:lvl>
     <w:lvl w:ilvl="4">
       <w:start w:val="1"/>
-      <w:numFmt w:val="decimal"/>
-      <w:lvlText w:val="%5."/>
+      <w:numFmt w:val="bullet"/>
+      <w:lvlText w:val="◦"/>
       <w:lvlJc w:val="start"/>
       <w:pPr>
         <w:tabs>
@@ -9582,12 +9174,14 @@
         </w:tabs>
         <w:ind w:start="2160" w:hanging="360"/>
       </w:pPr>
-      <w:rPr/>
+      <w:rPr>
+        <w:rFonts w:ascii="OpenSymbol" w:hAnsi="OpenSymbol" w:cs="OpenSymbol" w:hint="default"/>
+      </w:rPr>
     </w:lvl>
     <w:lvl w:ilvl="5">
       <w:start w:val="1"/>
-      <w:numFmt w:val="decimal"/>
-      <w:lvlText w:val="%6."/>
+      <w:numFmt w:val="bullet"/>
+      <w:lvlText w:val="▪"/>
       <w:lvlJc w:val="start"/>
       <w:pPr>
         <w:tabs>
@@ -9595,12 +9189,14 @@
         </w:tabs>
         <w:ind w:start="2520" w:hanging="360"/>
       </w:pPr>
-      <w:rPr/>
+      <w:rPr>
+        <w:rFonts w:ascii="OpenSymbol" w:hAnsi="OpenSymbol" w:cs="OpenSymbol" w:hint="default"/>
+      </w:rPr>
     </w:lvl>
     <w:lvl w:ilvl="6">
       <w:start w:val="1"/>
-      <w:numFmt w:val="decimal"/>
-      <w:lvlText w:val="%7."/>
+      <w:numFmt w:val="bullet"/>
+      <w:lvlText w:val=""/>
       <w:lvlJc w:val="start"/>
       <w:pPr>
         <w:tabs>
@@ -9608,12 +9204,14 @@
         </w:tabs>
         <w:ind w:start="2880" w:hanging="360"/>
       </w:pPr>
-      <w:rPr/>
+      <w:rPr>
+        <w:rFonts w:ascii="Symbol" w:hAnsi="Symbol" w:cs="Symbol" w:hint="default"/>
+      </w:rPr>
     </w:lvl>
     <w:lvl w:ilvl="7">
       <w:start w:val="1"/>
-      <w:numFmt w:val="decimal"/>
-      <w:lvlText w:val="%8."/>
+      <w:numFmt w:val="bullet"/>
+      <w:lvlText w:val="◦"/>
       <w:lvlJc w:val="start"/>
       <w:pPr>
         <w:tabs>
@@ -9621,12 +9219,14 @@
         </w:tabs>
         <w:ind w:start="3240" w:hanging="360"/>
       </w:pPr>
-      <w:rPr/>
+      <w:rPr>
+        <w:rFonts w:ascii="OpenSymbol" w:hAnsi="OpenSymbol" w:cs="OpenSymbol" w:hint="default"/>
+      </w:rPr>
     </w:lvl>
     <w:lvl w:ilvl="8">
       <w:start w:val="1"/>
-      <w:numFmt w:val="decimal"/>
-      <w:lvlText w:val="%9."/>
+      <w:numFmt w:val="bullet"/>
+      <w:lvlText w:val="▪"/>
       <w:lvlJc w:val="start"/>
       <w:pPr>
         <w:tabs>
@@ -9634,7 +9234,9 @@
         </w:tabs>
         <w:ind w:start="3600" w:hanging="360"/>
       </w:pPr>
-      <w:rPr/>
+      <w:rPr>
+        <w:rFonts w:ascii="OpenSymbol" w:hAnsi="OpenSymbol" w:cs="OpenSymbol" w:hint="default"/>
+      </w:rPr>
     </w:lvl>
   </w:abstractNum>
   <w:abstractNum w:abstractNumId="7">
@@ -9896,8 +9498,8 @@
   <w:abstractNum w:abstractNumId="9">
     <w:lvl w:ilvl="0">
       <w:start w:val="1"/>
-      <w:numFmt w:val="bullet"/>
-      <w:lvlText w:val=""/>
+      <w:numFmt w:val="decimal"/>
+      <w:lvlText w:val="%1."/>
       <w:lvlJc w:val="start"/>
       <w:pPr>
         <w:tabs>
@@ -9905,14 +9507,12 @@
         </w:tabs>
         <w:ind w:start="720" w:hanging="360"/>
       </w:pPr>
-      <w:rPr>
-        <w:rFonts w:ascii="Symbol" w:hAnsi="Symbol" w:cs="Symbol" w:hint="default"/>
-      </w:rPr>
+      <w:rPr/>
     </w:lvl>
     <w:lvl w:ilvl="1">
       <w:start w:val="1"/>
-      <w:numFmt w:val="bullet"/>
-      <w:lvlText w:val="◦"/>
+      <w:numFmt w:val="decimal"/>
+      <w:lvlText w:val="%2."/>
       <w:lvlJc w:val="start"/>
       <w:pPr>
         <w:tabs>
@@ -9920,14 +9520,12 @@
         </w:tabs>
         <w:ind w:start="1080" w:hanging="360"/>
       </w:pPr>
-      <w:rPr>
-        <w:rFonts w:ascii="OpenSymbol" w:hAnsi="OpenSymbol" w:cs="OpenSymbol" w:hint="default"/>
-      </w:rPr>
+      <w:rPr/>
     </w:lvl>
     <w:lvl w:ilvl="2">
       <w:start w:val="1"/>
-      <w:numFmt w:val="bullet"/>
-      <w:lvlText w:val="▪"/>
+      <w:numFmt w:val="decimal"/>
+      <w:lvlText w:val="%3."/>
       <w:lvlJc w:val="start"/>
       <w:pPr>
         <w:tabs>
@@ -9935,14 +9533,12 @@
         </w:tabs>
         <w:ind w:start="1440" w:hanging="360"/>
       </w:pPr>
-      <w:rPr>
-        <w:rFonts w:ascii="OpenSymbol" w:hAnsi="OpenSymbol" w:cs="OpenSymbol" w:hint="default"/>
-      </w:rPr>
+      <w:rPr/>
     </w:lvl>
     <w:lvl w:ilvl="3">
       <w:start w:val="1"/>
-      <w:numFmt w:val="bullet"/>
-      <w:lvlText w:val=""/>
+      <w:numFmt w:val="decimal"/>
+      <w:lvlText w:val="%4."/>
       <w:lvlJc w:val="start"/>
       <w:pPr>
         <w:tabs>
@@ -9950,14 +9546,12 @@
         </w:tabs>
         <w:ind w:start="1800" w:hanging="360"/>
       </w:pPr>
-      <w:rPr>
-        <w:rFonts w:ascii="Symbol" w:hAnsi="Symbol" w:cs="Symbol" w:hint="default"/>
-      </w:rPr>
+      <w:rPr/>
     </w:lvl>
     <w:lvl w:ilvl="4">
       <w:start w:val="1"/>
-      <w:numFmt w:val="bullet"/>
-      <w:lvlText w:val="◦"/>
+      <w:numFmt w:val="decimal"/>
+      <w:lvlText w:val="%5."/>
       <w:lvlJc w:val="start"/>
       <w:pPr>
         <w:tabs>
@@ -9965,14 +9559,12 @@
         </w:tabs>
         <w:ind w:start="2160" w:hanging="360"/>
       </w:pPr>
-      <w:rPr>
-        <w:rFonts w:ascii="OpenSymbol" w:hAnsi="OpenSymbol" w:cs="OpenSymbol" w:hint="default"/>
-      </w:rPr>
+      <w:rPr/>
     </w:lvl>
     <w:lvl w:ilvl="5">
       <w:start w:val="1"/>
-      <w:numFmt w:val="bullet"/>
-      <w:lvlText w:val="▪"/>
+      <w:numFmt w:val="decimal"/>
+      <w:lvlText w:val="%6."/>
       <w:lvlJc w:val="start"/>
       <w:pPr>
         <w:tabs>
@@ -9980,14 +9572,12 @@
         </w:tabs>
         <w:ind w:start="2520" w:hanging="360"/>
       </w:pPr>
-      <w:rPr>
-        <w:rFonts w:ascii="OpenSymbol" w:hAnsi="OpenSymbol" w:cs="OpenSymbol" w:hint="default"/>
-      </w:rPr>
+      <w:rPr/>
     </w:lvl>
     <w:lvl w:ilvl="6">
       <w:start w:val="1"/>
-      <w:numFmt w:val="bullet"/>
-      <w:lvlText w:val=""/>
+      <w:numFmt w:val="decimal"/>
+      <w:lvlText w:val="%7."/>
       <w:lvlJc w:val="start"/>
       <w:pPr>
         <w:tabs>
@@ -9995,14 +9585,12 @@
         </w:tabs>
         <w:ind w:start="2880" w:hanging="360"/>
       </w:pPr>
-      <w:rPr>
-        <w:rFonts w:ascii="Symbol" w:hAnsi="Symbol" w:cs="Symbol" w:hint="default"/>
-      </w:rPr>
+      <w:rPr/>
     </w:lvl>
     <w:lvl w:ilvl="7">
       <w:start w:val="1"/>
-      <w:numFmt w:val="bullet"/>
-      <w:lvlText w:val="◦"/>
+      <w:numFmt w:val="decimal"/>
+      <w:lvlText w:val="%8."/>
       <w:lvlJc w:val="start"/>
       <w:pPr>
         <w:tabs>
@@ -10010,14 +9598,12 @@
         </w:tabs>
         <w:ind w:start="3240" w:hanging="360"/>
       </w:pPr>
-      <w:rPr>
-        <w:rFonts w:ascii="OpenSymbol" w:hAnsi="OpenSymbol" w:cs="OpenSymbol" w:hint="default"/>
-      </w:rPr>
+      <w:rPr/>
     </w:lvl>
     <w:lvl w:ilvl="8">
       <w:start w:val="1"/>
-      <w:numFmt w:val="bullet"/>
-      <w:lvlText w:val="▪"/>
+      <w:numFmt w:val="decimal"/>
+      <w:lvlText w:val="%9."/>
       <w:lvlJc w:val="start"/>
       <w:pPr>
         <w:tabs>
@@ -10025,9 +9611,7 @@
         </w:tabs>
         <w:ind w:start="3600" w:hanging="360"/>
       </w:pPr>
-      <w:rPr>
-        <w:rFonts w:ascii="OpenSymbol" w:hAnsi="OpenSymbol" w:cs="OpenSymbol" w:hint="default"/>
-      </w:rPr>
+      <w:rPr/>
     </w:lvl>
   </w:abstractNum>
   <w:abstractNum w:abstractNumId="10">
@@ -10578,6 +10162,7 @@
     <w:rsid w:val="0091503c"/>
     <w:pPr>
       <w:widowControl/>
+      <w:suppressAutoHyphens w:val="true"/>
       <w:bidi w:val="0"/>
       <w:spacing w:before="0" w:after="0"/>
       <w:jc w:val="start"/>
@@ -10588,7 +10173,7 @@
       <w:kern w:val="0"/>
       <w:sz w:val="24"/>
       <w:szCs w:val="24"/>
-      <w:lang w:eastAsia="es-ES" w:val="es-ES" w:bidi="ar-SA"/>
+      <w:lang w:val="es-ES" w:eastAsia="es-ES" w:bidi="ar-SA"/>
     </w:rPr>
   </w:style>
   <w:style w:type="paragraph" w:styleId="Heading1">
@@ -10802,12 +10387,17 @@
       <w:color w:val="808080"/>
     </w:rPr>
   </w:style>
-  <w:style w:type="character" w:styleId="Bolos">
-    <w:name w:val="Bolos"/>
+  <w:style w:type="character" w:styleId="Bolosuser">
+    <w:name w:val="Bolos (user)"/>
     <w:qFormat/>
     <w:rPr>
       <w:rFonts w:ascii="OpenSymbol" w:hAnsi="OpenSymbol" w:eastAsia="OpenSymbol" w:cs="OpenSymbol"/>
     </w:rPr>
+  </w:style>
+  <w:style w:type="character" w:styleId="Smbolosdenumeracinuser">
+    <w:name w:val="Símbolos de numeración (user)"/>
+    <w:qFormat/>
+    <w:rPr/>
   </w:style>
   <w:style w:type="character" w:styleId="Smbolosdenumeracin">
     <w:name w:val="Símbolos de numeración"/>
@@ -10872,6 +10462,32 @@
       <w:rFonts w:cs="Noto Sans Devanagari"/>
     </w:rPr>
   </w:style>
+  <w:style w:type="paragraph" w:styleId="Ttulouser">
+    <w:name w:val="Título (user)"/>
+    <w:basedOn w:val="Normal"/>
+    <w:next w:val="BodyText"/>
+    <w:qFormat/>
+    <w:pPr>
+      <w:keepNext w:val="true"/>
+      <w:spacing w:before="240" w:after="120"/>
+    </w:pPr>
+    <w:rPr>
+      <w:rFonts w:ascii="Liberation Sans" w:hAnsi="Liberation Sans" w:eastAsia="Noto Sans CJK SC" w:cs="Noto Sans Devanagari"/>
+      <w:sz w:val="28"/>
+      <w:szCs w:val="28"/>
+    </w:rPr>
+  </w:style>
+  <w:style w:type="paragraph" w:styleId="ndiceuser">
+    <w:name w:val="Índice (user)"/>
+    <w:basedOn w:val="Normal"/>
+    <w:qFormat/>
+    <w:pPr>
+      <w:suppressLineNumbers/>
+    </w:pPr>
+    <w:rPr>
+      <w:rFonts w:cs="Noto Sans Devanagari"/>
+    </w:rPr>
+  </w:style>
   <w:style w:type="paragraph" w:styleId="Title">
     <w:name w:val="Title"/>
     <w:basedOn w:val="Normal"/>
@@ -10888,6 +10504,13 @@
       <w:sz w:val="72"/>
       <w:szCs w:val="72"/>
     </w:rPr>
+  </w:style>
+  <w:style w:type="paragraph" w:styleId="Cabeceraypieuser">
+    <w:name w:val="Cabecera y pie (user)"/>
+    <w:basedOn w:val="Normal"/>
+    <w:qFormat/>
+    <w:pPr/>
+    <w:rPr/>
   </w:style>
   <w:style w:type="paragraph" w:styleId="Cabeceraypie">
     <w:name w:val="Cabecera y pie"/>
@@ -11028,8 +10651,8 @@
       <w:bCs/>
     </w:rPr>
   </w:style>
-  <w:style w:type="paragraph" w:styleId="Contenidodelatabla">
-    <w:name w:val="Contenido de la tabla"/>
+  <w:style w:type="paragraph" w:styleId="Contenidodelatablauser">
+    <w:name w:val="Contenido de la tabla (user)"/>
     <w:basedOn w:val="Normal"/>
     <w:qFormat/>
     <w:pPr>
@@ -11038,9 +10661,9 @@
     </w:pPr>
     <w:rPr/>
   </w:style>
-  <w:style w:type="paragraph" w:styleId="Ttulodelatabla">
-    <w:name w:val="Título de la tabla"/>
-    <w:basedOn w:val="Contenidodelatabla"/>
+  <w:style w:type="paragraph" w:styleId="Ttulodelatablauser">
+    <w:name w:val="Título de la tabla (user)"/>
+    <w:basedOn w:val="Contenidodelatablauser"/>
     <w:qFormat/>
     <w:pPr>
       <w:suppressLineNumbers/>
@@ -11051,8 +10674,8 @@
       <w:bCs/>
     </w:rPr>
   </w:style>
-  <w:style w:type="paragraph" w:styleId="Textopreformateado">
-    <w:name w:val="Texto preformateado"/>
+  <w:style w:type="paragraph" w:styleId="Textopreformateadouser">
+    <w:name w:val="Texto preformateado (user)"/>
     <w:basedOn w:val="Normal"/>
     <w:qFormat/>
     <w:pPr>
@@ -11064,8 +10687,8 @@
       <w:szCs w:val="20"/>
     </w:rPr>
   </w:style>
-  <w:style w:type="numbering" w:styleId="Ningunalista" w:default="1">
-    <w:name w:val="Ninguna lista"/>
+  <w:style w:type="numbering" w:styleId="Ningunalistauser" w:default="1">
+    <w:name w:val="Ninguna lista (user)"/>
     <w:uiPriority w:val="99"/>
     <w:semiHidden/>
     <w:unhideWhenUsed/>
@@ -11090,7 +10713,6 @@
     <w:basedOn w:val="Tablanormal"/>
     <w:uiPriority w:val="49"/>
     <w:rsid w:val="0091503c"/>
-    <w:rPr/>
     <w:tblPr>
       <w:tblStyleRowBandSize w:val="1"/>
       <w:tblStyleColBandSize w:val="1"/>

</xml_diff>